<commit_message>
fix: Add explanations in lab theory
</commit_message>
<xml_diff>
--- a/09-semester/Устройства приёма и преобразования сигналов/Лабы/Лабы 1 и 2/LR1-2.docx
+++ b/09-semester/Устройства приёма и преобразования сигналов/Лабы/Лабы 1 и 2/LR1-2.docx
@@ -27,21 +27,7 @@
         <w:rPr>
           <w:lang w:val="ru-RU" w:eastAsia="ru-RU"/>
         </w:rPr>
-        <w:t xml:space="preserve">Изучить проявление нелинейных искажений усилительного тракта, освоить формирование </w:t>
-      </w:r>
-      <w:proofErr w:type="spellStart"/>
-      <w:r>
-        <w:rPr>
-          <w:lang w:val="ru-RU" w:eastAsia="ru-RU"/>
-        </w:rPr>
-        <w:t>двухтонального</w:t>
-      </w:r>
-      <w:proofErr w:type="spellEnd"/>
-      <w:r>
-        <w:rPr>
-          <w:lang w:val="ru-RU" w:eastAsia="ru-RU"/>
-        </w:rPr>
-        <w:t xml:space="preserve"> сигнала с помощью сумматора мощности для исследования параметров усилителя мощности методом гармонического баланса.</w:t>
+        <w:t>Изучить проявление нелинейных искажений усилительного тракта, освоить формирование двухтонального сигнала с помощью сумматора мощности для исследования параметров усилителя мощности методом гармонического баланса.</w:t>
       </w:r>
     </w:p>
     <w:p>
@@ -96,21 +82,7 @@
         <w:rPr>
           <w:lang w:val="ru-RU" w:eastAsia="ru-RU"/>
         </w:rPr>
-        <w:t xml:space="preserve">Рассмотреть вариант формирования </w:t>
-      </w:r>
-      <w:proofErr w:type="spellStart"/>
-      <w:r>
-        <w:rPr>
-          <w:lang w:val="ru-RU" w:eastAsia="ru-RU"/>
-        </w:rPr>
-        <w:t>двухтонального</w:t>
-      </w:r>
-      <w:proofErr w:type="spellEnd"/>
-      <w:r>
-        <w:rPr>
-          <w:lang w:val="ru-RU" w:eastAsia="ru-RU"/>
-        </w:rPr>
-        <w:t xml:space="preserve"> сигнала с помощью сумматора мощности.</w:t>
+        <w:t>Рассмотреть вариант формирования двухтонального сигнала с помощью сумматора мощности.</w:t>
       </w:r>
     </w:p>
     <w:p>
@@ -130,21 +102,7 @@
         <w:rPr>
           <w:lang w:val="ru-RU" w:eastAsia="ru-RU"/>
         </w:rPr>
-        <w:t xml:space="preserve">В среде Advanced Design System собрать схему </w:t>
-      </w:r>
-      <w:proofErr w:type="spellStart"/>
-      <w:r>
-        <w:rPr>
-          <w:lang w:val="ru-RU" w:eastAsia="ru-RU"/>
-        </w:rPr>
-        <w:t>двухтонального</w:t>
-      </w:r>
-      <w:proofErr w:type="spellEnd"/>
-      <w:r>
-        <w:rPr>
-          <w:lang w:val="ru-RU" w:eastAsia="ru-RU"/>
-        </w:rPr>
-        <w:t xml:space="preserve"> возбуждения, модели усилителя мощности и согласованной нагрузки по предоставленному рисунку.</w:t>
+        <w:t>В среде Advanced Design System собрать схему двухтонального возбуждения, модели усилителя мощности и согласованной нагрузки по предоставленному рисунку.</w:t>
       </w:r>
     </w:p>
     <w:p>
@@ -164,21 +122,7 @@
         <w:rPr>
           <w:lang w:val="ru-RU" w:eastAsia="ru-RU"/>
         </w:rPr>
-        <w:t xml:space="preserve">Настроить анализ </w:t>
-      </w:r>
-      <w:proofErr w:type="spellStart"/>
-      <w:r>
-        <w:rPr>
-          <w:lang w:val="ru-RU" w:eastAsia="ru-RU"/>
-        </w:rPr>
-        <w:t>Harmonic</w:t>
-      </w:r>
-      <w:proofErr w:type="spellEnd"/>
-      <w:r>
-        <w:rPr>
-          <w:lang w:val="ru-RU" w:eastAsia="ru-RU"/>
-        </w:rPr>
-        <w:t xml:space="preserve"> Balance для двух основных частот и подготовить модель к последующему измерению спектральных составляющих.</w:t>
+        <w:t>Настроить анализ Harmonic Balance для двух основных частот и подготовить модель к последующему измерению спектральных составляющих.</w:t>
       </w:r>
     </w:p>
     <w:p>
@@ -492,28 +436,7 @@
           <w:rFonts w:ascii="Times New Roman" w:eastAsia="Times New Roman" w:hAnsi="Times New Roman" w:cs="Times New Roman"/>
           <w:lang w:val="ru-RU" w:eastAsia="ru-RU"/>
         </w:rPr>
-        <w:t>1.</w:t>
-      </w:r>
-      <w:r>
-        <w:rPr>
-          <w:rFonts w:ascii="Times New Roman" w:eastAsia="Times New Roman" w:hAnsi="Times New Roman" w:cs="Times New Roman"/>
-          <w:lang w:val="ru-RU" w:eastAsia="ru-RU"/>
-        </w:rPr>
-        <w:t>2</w:t>
-      </w:r>
-      <w:r>
-        <w:rPr>
-          <w:rFonts w:ascii="Times New Roman" w:eastAsia="Times New Roman" w:hAnsi="Times New Roman" w:cs="Times New Roman"/>
-          <w:lang w:val="ru-RU" w:eastAsia="ru-RU"/>
-        </w:rPr>
-        <w:t xml:space="preserve"> </w:t>
-      </w:r>
-      <w:r>
-        <w:rPr>
-          <w:rFonts w:ascii="Times New Roman" w:eastAsia="Times New Roman" w:hAnsi="Times New Roman" w:cs="Times New Roman"/>
-          <w:lang w:val="ru-RU" w:eastAsia="ru-RU"/>
-        </w:rPr>
-        <w:t>Один тон. Откуда берутся гармоники</w:t>
+        <w:t>1.2 Один тон. Откуда берутся гармоники</w:t>
       </w:r>
     </w:p>
     <w:p>
@@ -557,47 +480,7 @@
               <w:sz w:val="23"/>
               <w:lang w:eastAsia="ru-RU"/>
             </w:rPr>
-            <m:t xml:space="preserve"> = A</m:t>
-          </m:r>
-          <m:r>
-            <w:rPr>
-              <w:rFonts w:ascii="Cambria Math" w:hAnsi="Cambria Math"/>
-              <w:sz w:val="23"/>
-              <w:lang w:eastAsia="ru-RU"/>
-            </w:rPr>
-            <m:t>∙</m:t>
-          </m:r>
-          <m:r>
-            <w:rPr>
-              <w:rFonts w:ascii="Cambria Math" w:hAnsi="Cambria Math"/>
-              <w:sz w:val="23"/>
-              <w:lang w:eastAsia="ru-RU"/>
-            </w:rPr>
-            <m:t>sin(</m:t>
-          </m:r>
-          <m:r>
-            <w:rPr>
-              <w:rFonts w:ascii="Cambria Math" w:hAnsi="Cambria Math"/>
-              <w:sz w:val="23"/>
-              <w:lang w:eastAsia="ru-RU"/>
-            </w:rPr>
-            <m:t>2πf∙</m:t>
-          </m:r>
-          <m:r>
-            <w:rPr>
-              <w:rFonts w:ascii="Cambria Math" w:hAnsi="Cambria Math"/>
-              <w:sz w:val="23"/>
-              <w:lang w:eastAsia="ru-RU"/>
-            </w:rPr>
-            <m:t>t</m:t>
-          </m:r>
-          <m:r>
-            <w:rPr>
-              <w:rFonts w:ascii="Cambria Math" w:hAnsi="Cambria Math"/>
-              <w:sz w:val="23"/>
-              <w:lang w:eastAsia="ru-RU"/>
-            </w:rPr>
-            <m:t>)</m:t>
+            <m:t xml:space="preserve"> = A∙sin(2πf∙t)</m:t>
           </m:r>
         </m:oMath>
       </m:oMathPara>
@@ -654,15 +537,7 @@
             <w:sz w:val="23"/>
             <w:lang w:val="ru-RU" w:eastAsia="ru-RU"/>
           </w:rPr>
-          <m:t>G</m:t>
-        </m:r>
-        <m:r>
-          <w:rPr>
-            <w:rFonts w:ascii="Cambria Math" w:hAnsi="Cambria Math"/>
-            <w:sz w:val="23"/>
-            <w:lang w:val="ru-RU" w:eastAsia="ru-RU"/>
-          </w:rPr>
-          <m:t>₁</m:t>
+          <m:t>G₁</m:t>
         </m:r>
         <m:r>
           <w:rPr>
@@ -904,15 +779,7 @@
             <w:sz w:val="23"/>
             <w:lang w:val="ru-RU" w:eastAsia="ru-RU"/>
           </w:rPr>
-          <m:t>=</m:t>
-        </m:r>
-        <m:r>
-          <w:rPr>
-            <w:rFonts w:ascii="Cambria Math" w:hAnsi="Cambria Math"/>
-            <w:sz w:val="23"/>
-            <w:lang w:val="ru-RU" w:eastAsia="ru-RU"/>
-          </w:rPr>
-          <m:t>G₂</m:t>
+          <m:t>=G₂</m:t>
         </m:r>
         <m:sSup>
           <m:sSupPr>
@@ -1108,40 +975,16 @@
         <w:rPr>
           <w:lang w:val="ru-RU"/>
         </w:rPr>
-        <w:t>–</w:t>
+        <w:t>– появляется</w:t>
+      </w:r>
+      <w:r>
+        <w:t> </w:t>
       </w:r>
       <w:r>
         <w:rPr>
           <w:lang w:val="ru-RU"/>
         </w:rPr>
-        <w:t xml:space="preserve"> </w:t>
-      </w:r>
-      <w:r>
-        <w:rPr>
-          <w:lang w:val="ru-RU"/>
-        </w:rPr>
-        <w:t>появляется</w:t>
-      </w:r>
-      <w:r>
-        <w:t> </w:t>
-      </w:r>
-      <w:r>
-        <w:rPr>
-          <w:lang w:val="ru-RU"/>
-        </w:rPr>
-        <w:t>постоянная</w:t>
-      </w:r>
-      <w:r>
-        <w:rPr>
-          <w:lang w:val="ru-RU"/>
-        </w:rPr>
-        <w:t xml:space="preserve"> </w:t>
-      </w:r>
-      <w:r>
-        <w:rPr>
-          <w:lang w:val="ru-RU"/>
-        </w:rPr>
-        <w:t>составляющая</w:t>
+        <w:t>постоянная составляющая</w:t>
       </w:r>
       <w:r>
         <w:t> </w:t>
@@ -1305,7 +1148,7 @@
       <w:r>
         <w:rPr>
           <w:rFonts w:ascii="Times New Roman" w:eastAsia="Times New Roman" w:hAnsi="Times New Roman" w:cs="Times New Roman"/>
-          <w:lang w:eastAsia="ru-RU"/>
+          <w:lang w:val="ru-RU" w:eastAsia="ru-RU"/>
         </w:rPr>
         <w:t>3</w:t>
       </w:r>
@@ -1314,39 +1157,7 @@
           <w:rFonts w:ascii="Times New Roman" w:eastAsia="Times New Roman" w:hAnsi="Times New Roman" w:cs="Times New Roman"/>
           <w:lang w:val="ru-RU" w:eastAsia="ru-RU"/>
         </w:rPr>
-        <w:t xml:space="preserve"> </w:t>
-      </w:r>
-      <w:proofErr w:type="spellStart"/>
-      <w:r>
-        <w:rPr>
-          <w:rFonts w:ascii="Times New Roman" w:eastAsia="Times New Roman" w:hAnsi="Times New Roman" w:cs="Times New Roman"/>
-          <w:lang w:val="ru-RU" w:eastAsia="ru-RU"/>
-        </w:rPr>
-        <w:t>Интермодуляция</w:t>
-      </w:r>
-      <w:proofErr w:type="spellEnd"/>
-      <w:r>
-        <w:rPr>
-          <w:rFonts w:ascii="Times New Roman" w:eastAsia="Times New Roman" w:hAnsi="Times New Roman" w:cs="Times New Roman"/>
-          <w:lang w:val="ru-RU" w:eastAsia="ru-RU"/>
-        </w:rPr>
-        <w:t xml:space="preserve"> </w:t>
-      </w:r>
-      <w:proofErr w:type="spellStart"/>
-      <w:r>
-        <w:rPr>
-          <w:rFonts w:ascii="Times New Roman" w:eastAsia="Times New Roman" w:hAnsi="Times New Roman" w:cs="Times New Roman"/>
-          <w:lang w:val="ru-RU" w:eastAsia="ru-RU"/>
-        </w:rPr>
-        <w:t>двухтонального</w:t>
-      </w:r>
-      <w:proofErr w:type="spellEnd"/>
-      <w:r>
-        <w:rPr>
-          <w:rFonts w:ascii="Times New Roman" w:eastAsia="Times New Roman" w:hAnsi="Times New Roman" w:cs="Times New Roman"/>
-          <w:lang w:val="ru-RU" w:eastAsia="ru-RU"/>
-        </w:rPr>
-        <w:t xml:space="preserve"> сигнала</w:t>
+        <w:t xml:space="preserve"> Интермодуляция двухтонального сигнала</w:t>
       </w:r>
     </w:p>
     <w:p>
@@ -1359,21 +1170,7 @@
         <w:rPr>
           <w:lang w:val="ru-RU" w:eastAsia="ru-RU"/>
         </w:rPr>
-        <w:t xml:space="preserve">Пусть X – </w:t>
-      </w:r>
-      <w:proofErr w:type="spellStart"/>
-      <w:r>
-        <w:rPr>
-          <w:lang w:val="ru-RU" w:eastAsia="ru-RU"/>
-        </w:rPr>
-        <w:t>двухтональный</w:t>
-      </w:r>
-      <w:proofErr w:type="spellEnd"/>
-      <w:r>
-        <w:rPr>
-          <w:lang w:val="ru-RU" w:eastAsia="ru-RU"/>
-        </w:rPr>
-        <w:t xml:space="preserve"> сигнал с амплитудами A и B:</w:t>
+        <w:t>Пусть X – двухтональный сигнал с амплитудами A и B:</w:t>
       </w:r>
     </w:p>
     <w:tbl>
@@ -1504,35 +1301,7 @@
         <w:rPr>
           <w:lang w:val="ru-RU" w:eastAsia="ru-RU"/>
         </w:rPr>
-        <w:t>где α = 2π</w:t>
-      </w:r>
-      <w:proofErr w:type="spellStart"/>
-      <w:r>
-        <w:rPr>
-          <w:lang w:val="ru-RU" w:eastAsia="ru-RU"/>
-        </w:rPr>
-        <w:t>f₁t</w:t>
-      </w:r>
-      <w:proofErr w:type="spellEnd"/>
-      <w:r>
-        <w:rPr>
-          <w:lang w:val="ru-RU" w:eastAsia="ru-RU"/>
-        </w:rPr>
-        <w:t>, β = 2π</w:t>
-      </w:r>
-      <w:proofErr w:type="spellStart"/>
-      <w:r>
-        <w:rPr>
-          <w:lang w:val="ru-RU" w:eastAsia="ru-RU"/>
-        </w:rPr>
-        <w:t>f₂t</w:t>
-      </w:r>
-      <w:proofErr w:type="spellEnd"/>
-      <w:r>
-        <w:rPr>
-          <w:lang w:val="ru-RU" w:eastAsia="ru-RU"/>
-        </w:rPr>
-        <w:t>, f₁ и f₂ – частоты гармонических сигналов, рис. 2.</w:t>
+        <w:t>где α = 2πf₁t, β = 2πf₂t, f₁ и f₂ – частоты гармонических сигналов, рис. 2.</w:t>
       </w:r>
     </w:p>
     <w:p>
@@ -1730,6 +1499,9 @@
                   <m:t xml:space="preserve"> -AB cos(α+β)+AB cos(α - β) -</m:t>
                 </m:r>
                 <m:r>
+                  <m:rPr>
+                    <m:sty m:val="p"/>
+                  </m:rPr>
                   <w:rPr>
                     <w:rFonts w:ascii="Cambria Math" w:hAnsi="Cambria Math"/>
                     <w:lang w:val="ru-RU"/>
@@ -2114,6 +1886,9 @@
                   <m:t xml:space="preserve"> A²B) sin +</m:t>
                 </m:r>
                 <m:r>
+                  <m:rPr>
+                    <m:sty m:val="p"/>
+                  </m:rPr>
                   <w:rPr>
                     <w:rFonts w:ascii="Cambria Math" w:hAnsi="Cambria Math"/>
                   </w:rPr>
@@ -2271,15 +2046,7 @@
                     <w:sz w:val="23"/>
                     <w:lang w:eastAsia="ru-RU"/>
                   </w:rPr>
-                  <m:t>)</m:t>
-                </m:r>
-                <m:r>
-                  <w:rPr>
-                    <w:rFonts w:ascii="Cambria Math" w:hAnsi="Cambria Math"/>
-                    <w:sz w:val="23"/>
-                    <w:lang w:eastAsia="ru-RU"/>
-                  </w:rPr>
-                  <m:t>-</m:t>
+                  <m:t>)-</m:t>
                 </m:r>
                 <m:f>
                   <m:fPr>
@@ -2589,9 +2356,16 @@
       </w:r>
       <w:r>
         <w:rPr>
-          <w:lang w:val="ru-RU" w:eastAsia="ru-RU"/>
-        </w:rPr>
-        <w:t>синие стрелки</w:t>
+          <w:color w:val="0070C0"/>
+          <w:lang w:val="ru-RU" w:eastAsia="ru-RU"/>
+        </w:rPr>
+        <w:t>синие</w:t>
+      </w:r>
+      <w:r>
+        <w:rPr>
+          <w:lang w:val="ru-RU" w:eastAsia="ru-RU"/>
+        </w:rPr>
+        <w:t xml:space="preserve"> стрелки</w:t>
       </w:r>
       <w:r>
         <w:rPr>
@@ -2668,9 +2442,16 @@
       </w:r>
       <w:r>
         <w:rPr>
-          <w:lang w:val="ru-RU" w:eastAsia="ru-RU"/>
-        </w:rPr>
-        <w:t>красные стрелки</w:t>
+          <w:color w:val="FF0000"/>
+          <w:lang w:val="ru-RU" w:eastAsia="ru-RU"/>
+        </w:rPr>
+        <w:t>красные</w:t>
+      </w:r>
+      <w:r>
+        <w:rPr>
+          <w:lang w:val="ru-RU" w:eastAsia="ru-RU"/>
+        </w:rPr>
+        <w:t xml:space="preserve"> стрелки</w:t>
       </w:r>
       <w:r>
         <w:rPr>
@@ -2994,23 +2775,7 @@
           <w:b/>
           <w:lang w:val="ru-RU" w:eastAsia="ru-RU"/>
         </w:rPr>
-        <w:t xml:space="preserve">Уровни гармонических составляющих на выходе для </w:t>
-      </w:r>
-      <w:proofErr w:type="spellStart"/>
-      <w:r>
-        <w:rPr>
-          <w:b/>
-          <w:lang w:val="ru-RU" w:eastAsia="ru-RU"/>
-        </w:rPr>
-        <w:t>двухтонального</w:t>
-      </w:r>
-      <w:proofErr w:type="spellEnd"/>
-      <w:r>
-        <w:rPr>
-          <w:b/>
-          <w:lang w:val="ru-RU" w:eastAsia="ru-RU"/>
-        </w:rPr>
-        <w:t xml:space="preserve"> сигнала с уровнями P_A и P_B</w:t>
+        <w:t>Уровни гармонических составляющих на выходе для двухтонального сигнала с уровнями P_A и P_B</w:t>
       </w:r>
     </w:p>
     <w:tbl>
@@ -3431,7 +3196,21 @@
                 <w:sz w:val="21"/>
                 <w:lang w:val="ru-RU" w:eastAsia="ru-RU"/>
               </w:rPr>
-              <w:t>G₁²P_B</w:t>
+              <w:t>G₁²P</w:t>
+            </w:r>
+            <w:r>
+              <w:rPr>
+                <w:sz w:val="21"/>
+                <w:lang w:val="ru-RU" w:eastAsia="ru-RU"/>
+              </w:rPr>
+              <w:t>_</w:t>
+            </w:r>
+            <w:r>
+              <w:rPr>
+                <w:sz w:val="21"/>
+                <w:lang w:val="ru-RU" w:eastAsia="ru-RU"/>
+              </w:rPr>
+              <w:t>B</w:t>
             </w:r>
           </w:p>
         </w:tc>
@@ -3847,11 +3626,6 @@
       </w:r>
     </w:p>
     <w:p>
-      <w:pPr>
-        <w:rPr>
-          <w:lang w:val="ru-RU"/>
-        </w:rPr>
-      </w:pPr>
       <w:r>
         <w:rPr>
           <w:lang w:val="ru-RU" w:eastAsia="ru-RU"/>
@@ -3920,23 +3694,7 @@
           <w:b/>
           <w:lang w:val="ru-RU" w:eastAsia="ru-RU"/>
         </w:rPr>
-        <w:t xml:space="preserve">Уровни гармонических составляющих на выходе для </w:t>
-      </w:r>
-      <w:proofErr w:type="spellStart"/>
-      <w:r>
-        <w:rPr>
-          <w:b/>
-          <w:lang w:val="ru-RU" w:eastAsia="ru-RU"/>
-        </w:rPr>
-        <w:t>двухтонального</w:t>
-      </w:r>
-      <w:proofErr w:type="spellEnd"/>
-      <w:r>
-        <w:rPr>
-          <w:b/>
-          <w:lang w:val="ru-RU" w:eastAsia="ru-RU"/>
-        </w:rPr>
-        <w:t xml:space="preserve"> сигнала с одинаковыми уровнями P_C</w:t>
+        <w:t>Уровни гармонических составляющих на выходе для двухтонального сигнала с одинаковыми уровнями P_C</w:t>
       </w:r>
     </w:p>
     <w:tbl>
@@ -4198,7 +3956,14 @@
                 <w:sz w:val="21"/>
                 <w:lang w:val="ru-RU" w:eastAsia="ru-RU"/>
               </w:rPr>
-              <w:t>1/2 G₁²C²</w:t>
+              <w:t>0.5</w:t>
+            </w:r>
+            <w:r>
+              <w:rPr>
+                <w:sz w:val="21"/>
+                <w:lang w:val="ru-RU" w:eastAsia="ru-RU"/>
+              </w:rPr>
+              <w:t xml:space="preserve"> G₁²C²</w:t>
             </w:r>
           </w:p>
         </w:tc>
@@ -4223,7 +3988,21 @@
                 <w:sz w:val="21"/>
                 <w:lang w:val="ru-RU" w:eastAsia="ru-RU"/>
               </w:rPr>
-              <w:t>G₁²P_C</w:t>
+              <w:t>G₁²P</w:t>
+            </w:r>
+            <w:r>
+              <w:rPr>
+                <w:sz w:val="21"/>
+                <w:lang w:val="ru-RU" w:eastAsia="ru-RU"/>
+              </w:rPr>
+              <w:t>_</w:t>
+            </w:r>
+            <w:r>
+              <w:rPr>
+                <w:sz w:val="21"/>
+                <w:lang w:val="ru-RU" w:eastAsia="ru-RU"/>
+              </w:rPr>
+              <w:t>C</w:t>
             </w:r>
           </w:p>
         </w:tc>
@@ -4329,7 +4108,14 @@
                 <w:sz w:val="21"/>
                 <w:lang w:val="ru-RU" w:eastAsia="ru-RU"/>
               </w:rPr>
-              <w:t>1/2 G₂²C⁴</w:t>
+              <w:t xml:space="preserve">0.5 </w:t>
+            </w:r>
+            <w:r>
+              <w:rPr>
+                <w:sz w:val="21"/>
+                <w:lang w:val="ru-RU" w:eastAsia="ru-RU"/>
+              </w:rPr>
+              <w:t>G₂²C⁴</w:t>
             </w:r>
           </w:p>
         </w:tc>
@@ -4460,7 +4246,28 @@
                 <w:sz w:val="21"/>
                 <w:lang w:val="ru-RU" w:eastAsia="ru-RU"/>
               </w:rPr>
-              <w:t>9/32 G₃²C⁶</w:t>
+              <w:t>(</w:t>
+            </w:r>
+            <w:r>
+              <w:rPr>
+                <w:sz w:val="21"/>
+                <w:lang w:val="ru-RU" w:eastAsia="ru-RU"/>
+              </w:rPr>
+              <w:t>9/32</w:t>
+            </w:r>
+            <w:r>
+              <w:rPr>
+                <w:sz w:val="21"/>
+                <w:lang w:val="ru-RU" w:eastAsia="ru-RU"/>
+              </w:rPr>
+              <w:t>)</w:t>
+            </w:r>
+            <w:r>
+              <w:rPr>
+                <w:sz w:val="21"/>
+                <w:lang w:val="ru-RU" w:eastAsia="ru-RU"/>
+              </w:rPr>
+              <w:t xml:space="preserve"> G₃²C⁶</w:t>
             </w:r>
           </w:p>
         </w:tc>
@@ -4508,7 +4315,7 @@
     <w:p>
       <w:pPr>
         <w:rPr>
-          <w:lang w:val="ru-RU"/>
+          <w:lang w:val="ru-RU" w:eastAsia="ru-RU"/>
         </w:rPr>
       </w:pPr>
       <w:r>
@@ -4522,100 +4329,130 @@
         <w:rPr>
           <w:lang w:val="ru-RU" w:eastAsia="ru-RU"/>
         </w:rPr>
-        <w:t>зависимость уровней</w:t>
+        <w:t>зависимость</w:t>
+      </w:r>
+      <w:r>
+        <w:rPr>
+          <w:lang w:val="ru-RU" w:eastAsia="ru-RU"/>
+        </w:rPr>
+        <w:t xml:space="preserve"> </w:t>
+      </w:r>
+      <w:r>
+        <w:rPr>
+          <w:lang w:val="ru-RU" w:eastAsia="ru-RU"/>
+        </w:rPr>
+        <w:t>уровней</w:t>
       </w:r>
       <w:proofErr w:type="gramEnd"/>
       <w:r>
         <w:rPr>
           <w:lang w:val="ru-RU" w:eastAsia="ru-RU"/>
         </w:rPr>
-        <w:t xml:space="preserve"> составляющих на выходе с частотами f₁ и f₂ (усиленный сигнал), f₂±f₁ (продукты второго порядка), 2f₂ − f₁ и 2f₁ − f₂ (третьего порядка) от мощности тона P_C. Как и следовало ожидать, наклон зависимости усиленного сигнала равен 1:1, продуктов нелинейности второго порядка – 2:1, третьего – 3:1. Это означает, что при каждом уменьшении мощности входного сигнала на 1 </w:t>
-      </w:r>
-      <w:proofErr w:type="spellStart"/>
-      <w:r>
-        <w:rPr>
-          <w:lang w:val="ru-RU" w:eastAsia="ru-RU"/>
-        </w:rPr>
-        <w:t>dB</w:t>
-      </w:r>
-      <w:proofErr w:type="spellEnd"/>
-      <w:r>
-        <w:rPr>
-          <w:lang w:val="ru-RU" w:eastAsia="ru-RU"/>
-        </w:rPr>
-        <w:t xml:space="preserve">, отношение мощности выходного сигнала и искажений второго порядка увеличивается на 1 </w:t>
-      </w:r>
-      <w:proofErr w:type="spellStart"/>
-      <w:r>
-        <w:rPr>
-          <w:lang w:val="ru-RU" w:eastAsia="ru-RU"/>
-        </w:rPr>
-        <w:t>dB</w:t>
-      </w:r>
-      <w:proofErr w:type="spellEnd"/>
-      <w:r>
-        <w:rPr>
-          <w:lang w:val="ru-RU" w:eastAsia="ru-RU"/>
-        </w:rPr>
-        <w:t xml:space="preserve">, а для третьего порядка – на 2 </w:t>
-      </w:r>
-      <w:proofErr w:type="spellStart"/>
-      <w:r>
-        <w:rPr>
-          <w:lang w:val="ru-RU" w:eastAsia="ru-RU"/>
-        </w:rPr>
-        <w:t>dB</w:t>
-      </w:r>
-      <w:proofErr w:type="spellEnd"/>
-      <w:r>
-        <w:rPr>
-          <w:lang w:val="ru-RU" w:eastAsia="ru-RU"/>
-        </w:rPr>
-        <w:t xml:space="preserve">. Следует учесть, что указанные зависимости справедливы лишь для малых сигналов (как правило, ниже точки </w:t>
-      </w:r>
-      <w:proofErr w:type="spellStart"/>
-      <w:r>
-        <w:rPr>
-          <w:lang w:val="ru-RU" w:eastAsia="ru-RU"/>
-        </w:rPr>
-        <w:t>децибельной</w:t>
-      </w:r>
-      <w:proofErr w:type="spellEnd"/>
-      <w:r>
-        <w:rPr>
-          <w:lang w:val="ru-RU" w:eastAsia="ru-RU"/>
-        </w:rPr>
-        <w:t xml:space="preserve"> компрессии на 6-10 </w:t>
-      </w:r>
-      <w:proofErr w:type="spellStart"/>
-      <w:r>
-        <w:rPr>
-          <w:lang w:val="ru-RU" w:eastAsia="ru-RU"/>
-        </w:rPr>
-        <w:t>dB</w:t>
-      </w:r>
-      <w:proofErr w:type="spellEnd"/>
-      <w:r>
-        <w:rPr>
-          <w:lang w:val="ru-RU" w:eastAsia="ru-RU"/>
-        </w:rPr>
-        <w:t>).</w:t>
+        <w:t xml:space="preserve"> </w:t>
+      </w:r>
+      <w:r>
+        <w:rPr>
+          <w:lang w:val="ru-RU" w:eastAsia="ru-RU"/>
+        </w:rPr>
+        <w:t>составляющих на выходе с частотами f₁ и f₂ (усиленный сигнал), f₂±f₁ (продукты второго порядка), 2f₂ − f₁ и 2f₁ − f₂ (третьего порядка) от мощности тона P_C.</w:t>
       </w:r>
     </w:p>
     <w:p>
       <w:pPr>
-        <w:jc w:val="center"/>
-      </w:pPr>
+        <w:rPr>
+          <w:lang w:val="ru-RU" w:eastAsia="ru-RU"/>
+        </w:rPr>
+      </w:pPr>
+    </w:p>
+    <w:p>
+      <w:pPr>
+        <w:rPr>
+          <w:lang w:eastAsia="ru-RU"/>
+        </w:rPr>
+      </w:pPr>
+      <w:r>
+        <w:rPr>
+          <w:lang w:val="ru-RU" w:eastAsia="ru-RU"/>
+        </w:rPr>
+        <w:t>Из формул</w:t>
+      </w:r>
+      <w:r>
+        <w:rPr>
+          <w:lang w:eastAsia="ru-RU"/>
+        </w:rPr>
+        <w:t>:</w:t>
+      </w:r>
+    </w:p>
+    <w:p>
+      <w:pPr>
+        <w:pStyle w:val="ae"/>
+        <w:numPr>
+          <w:ilvl w:val="0"/>
+          <w:numId w:val="13"/>
+        </w:numPr>
+        <w:rPr>
+          <w:lang w:val="ru-RU" w:eastAsia="ru-RU"/>
+        </w:rPr>
+      </w:pPr>
+      <w:r>
+        <w:rPr>
+          <w:lang w:val="ru-RU" w:eastAsia="ru-RU"/>
+        </w:rPr>
+        <w:t xml:space="preserve">Для частот </w:t>
+      </w:r>
+      <w:r>
+        <w:rPr>
+          <w:lang w:eastAsia="ru-RU"/>
+        </w:rPr>
+        <w:t>f</w:t>
+      </w:r>
+      <w:r>
+        <w:rPr>
+          <w:lang w:val="ru-RU" w:eastAsia="ru-RU"/>
+        </w:rPr>
+        <w:t xml:space="preserve">1 </w:t>
+      </w:r>
+      <w:r>
+        <w:rPr>
+          <w:lang w:val="ru-RU" w:eastAsia="ru-RU"/>
+        </w:rPr>
+        <w:t xml:space="preserve">и </w:t>
+      </w:r>
+      <w:r>
+        <w:rPr>
+          <w:lang w:eastAsia="ru-RU"/>
+        </w:rPr>
+        <w:t>f</w:t>
+      </w:r>
+      <w:r>
+        <w:rPr>
+          <w:lang w:val="ru-RU" w:eastAsia="ru-RU"/>
+        </w:rPr>
+        <w:t>2:</w:t>
+      </w:r>
+    </w:p>
+    <w:p>
+      <w:pPr>
+        <w:ind w:firstLine="0"/>
+        <w:rPr>
+          <w:lang w:val="ru-RU" w:eastAsia="ru-RU"/>
+        </w:rPr>
+      </w:pPr>
+      <w:r>
+        <w:rPr>
+          <w:lang w:val="ru-RU" w:eastAsia="ru-RU"/>
+        </w:rPr>
+        <w:t xml:space="preserve"> </w:t>
+      </w:r>
       <w:r>
         <w:rPr>
           <w:noProof/>
-          <w:lang w:val="ru-RU" w:eastAsia="ru-RU"/>
         </w:rPr>
         <w:drawing>
-          <wp:inline distT="0" distB="0" distL="0" distR="0" wp14:anchorId="4F620F08" wp14:editId="7FE77B19">
-            <wp:extent cx="3780000" cy="1841538"/>
-            <wp:effectExtent l="0" t="0" r="0" b="0"/>
-            <wp:docPr id="20" name="Picture 20"/>
+          <wp:inline distT="0" distB="0" distL="0" distR="0" wp14:anchorId="78A019FF" wp14:editId="644FC80F">
+            <wp:extent cx="4799380" cy="537845"/>
+            <wp:effectExtent l="0" t="0" r="1270" b="0"/>
+            <wp:docPr id="3" name="Рисунок 3"/>
             <wp:cNvGraphicFramePr>
               <a:graphicFrameLocks xmlns:a="http://schemas.openxmlformats.org/drawingml/2006/main" noChangeAspect="1"/>
             </wp:cNvGraphicFramePr>
@@ -4623,23 +4460,30 @@
               <a:graphicData uri="http://schemas.openxmlformats.org/drawingml/2006/picture">
                 <pic:pic xmlns:pic="http://schemas.openxmlformats.org/drawingml/2006/picture">
                   <pic:nvPicPr>
-                    <pic:cNvPr id="0" name="fig4.png"/>
+                    <pic:cNvPr id="1" name=""/>
                     <pic:cNvPicPr/>
                   </pic:nvPicPr>
-                  <pic:blipFill>
+                  <pic:blipFill rotWithShape="1">
                     <a:blip r:embed="rId14"/>
-                    <a:stretch>
-                      <a:fillRect/>
-                    </a:stretch>
+                    <a:srcRect l="737" t="10827"/>
+                    <a:stretch/>
                   </pic:blipFill>
-                  <pic:spPr>
+                  <pic:spPr bwMode="auto">
                     <a:xfrm>
                       <a:off x="0" y="0"/>
-                      <a:ext cx="3780000" cy="1841538"/>
+                      <a:ext cx="5060076" cy="567060"/>
                     </a:xfrm>
                     <a:prstGeom prst="rect">
                       <a:avLst/>
                     </a:prstGeom>
+                    <a:ln>
+                      <a:noFill/>
+                    </a:ln>
+                    <a:extLst>
+                      <a:ext uri="{53640926-AAD7-44D8-BBD7-CCE9431645EC}">
+                        <a14:shadowObscured xmlns:a14="http://schemas.microsoft.com/office/drawing/2010/main"/>
+                      </a:ext>
+                    </a:extLst>
                   </pic:spPr>
                 </pic:pic>
               </a:graphicData>
@@ -4650,118 +4494,28 @@
     </w:p>
     <w:p>
       <w:pPr>
-        <w:pStyle w:val="FigureCaptionLab"/>
-        <w:rPr>
-          <w:lang w:val="ru-RU"/>
-        </w:rPr>
-      </w:pPr>
-      <w:r>
-        <w:rPr>
-          <w:lang w:val="ru-RU" w:eastAsia="ru-RU"/>
-        </w:rPr>
-        <w:t xml:space="preserve">Рис. 4: Зависимость уровня продуктов нелинейных искажений от мощности тона входного </w:t>
-      </w:r>
-      <w:proofErr w:type="spellStart"/>
-      <w:r>
-        <w:rPr>
-          <w:lang w:val="ru-RU" w:eastAsia="ru-RU"/>
-        </w:rPr>
-        <w:t>двухтонального</w:t>
-      </w:r>
-      <w:proofErr w:type="spellEnd"/>
-      <w:r>
-        <w:rPr>
-          <w:lang w:val="ru-RU" w:eastAsia="ru-RU"/>
-        </w:rPr>
-        <w:t xml:space="preserve"> сигнала</w:t>
-      </w:r>
-    </w:p>
-    <w:p>
-      <w:pPr>
-        <w:rPr>
-          <w:lang w:val="ru-RU" w:eastAsia="ru-RU"/>
-        </w:rPr>
-      </w:pPr>
-      <w:r>
-        <w:rPr>
-          <w:lang w:val="ru-RU" w:eastAsia="ru-RU"/>
-        </w:rPr>
-        <w:lastRenderedPageBreak/>
-        <w:t xml:space="preserve">Точкой пересечения </w:t>
-      </w:r>
-      <w:proofErr w:type="spellStart"/>
-      <w:r>
-        <w:rPr>
-          <w:lang w:val="ru-RU" w:eastAsia="ru-RU"/>
-        </w:rPr>
-        <w:t>интермодуляции</w:t>
-      </w:r>
-      <w:proofErr w:type="spellEnd"/>
-      <w:r>
-        <w:rPr>
-          <w:lang w:val="ru-RU" w:eastAsia="ru-RU"/>
-        </w:rPr>
-        <w:t xml:space="preserve"> второго порядка по входу IIP2 (</w:t>
-      </w:r>
-      <w:proofErr w:type="spellStart"/>
-      <w:r>
-        <w:rPr>
-          <w:lang w:val="ru-RU" w:eastAsia="ru-RU"/>
-        </w:rPr>
-        <w:t>Input</w:t>
-      </w:r>
-      <w:proofErr w:type="spellEnd"/>
-      <w:r>
-        <w:rPr>
-          <w:lang w:val="ru-RU" w:eastAsia="ru-RU"/>
-        </w:rPr>
-        <w:t xml:space="preserve"> IP2) для </w:t>
-      </w:r>
-      <w:proofErr w:type="spellStart"/>
-      <w:r>
-        <w:rPr>
-          <w:lang w:val="ru-RU" w:eastAsia="ru-RU"/>
-        </w:rPr>
-        <w:t>двухтонального</w:t>
-      </w:r>
-      <w:proofErr w:type="spellEnd"/>
-      <w:r>
-        <w:rPr>
-          <w:lang w:val="ru-RU" w:eastAsia="ru-RU"/>
-        </w:rPr>
-        <w:t xml:space="preserve"> сигнала с частотами f₁ и f₂ и одинаковыми уровнями тонов называется такая мощность тона входного сигнала, при котором аппроксимированные выходные мощности усиленного тона и продуктов нелинейности второго порядка на частоте f₂ − f₁ (или f₂ + f₁) равны.</w:t>
-      </w:r>
-    </w:p>
-    <w:p>
-      <w:pPr>
-        <w:spacing w:after="200"/>
         <w:ind w:firstLine="0"/>
-        <w:jc w:val="left"/>
-        <w:rPr>
-          <w:lang w:val="ru-RU"/>
-        </w:rPr>
-      </w:pPr>
-      <w:r>
-        <w:rPr>
-          <w:lang w:val="ru-RU" w:eastAsia="ru-RU"/>
-        </w:rPr>
-        <w:br w:type="page"/>
-      </w:r>
-    </w:p>
-    <w:p>
-      <w:pPr>
-        <w:jc w:val="center"/>
+        <w:rPr>
+          <w:lang w:eastAsia="ru-RU"/>
+        </w:rPr>
       </w:pPr>
       <w:r>
         <w:rPr>
           <w:noProof/>
         </w:rPr>
-        <w:lastRenderedPageBreak/>
         <w:drawing>
-          <wp:inline distT="0" distB="0" distL="0" distR="0" wp14:anchorId="28DFB5BE" wp14:editId="294BF046">
-            <wp:extent cx="3248478" cy="2591162"/>
+          <wp:anchor distT="0" distB="0" distL="114300" distR="114300" simplePos="0" relativeHeight="251658240" behindDoc="0" locked="0" layoutInCell="1" allowOverlap="1" wp14:anchorId="45239740" wp14:editId="0DC51085">
+            <wp:simplePos x="0" y="0"/>
+            <wp:positionH relativeFrom="column">
+              <wp:posOffset>3256915</wp:posOffset>
+            </wp:positionH>
+            <wp:positionV relativeFrom="paragraph">
+              <wp:posOffset>338455</wp:posOffset>
+            </wp:positionV>
+            <wp:extent cx="1496190" cy="351762"/>
             <wp:effectExtent l="0" t="0" r="0" b="0"/>
-            <wp:docPr id="1" name="Рисунок 1"/>
+            <wp:wrapNone/>
+            <wp:docPr id="7" name="Рисунок 7"/>
             <wp:cNvGraphicFramePr>
               <a:graphicFrameLocks xmlns:a="http://schemas.openxmlformats.org/drawingml/2006/main" noChangeAspect="1"/>
             </wp:cNvGraphicFramePr>
@@ -4781,6 +4535,638 @@
                   <pic:spPr>
                     <a:xfrm>
                       <a:off x="0" y="0"/>
+                      <a:ext cx="1496190" cy="351762"/>
+                    </a:xfrm>
+                    <a:prstGeom prst="rect">
+                      <a:avLst/>
+                    </a:prstGeom>
+                  </pic:spPr>
+                </pic:pic>
+              </a:graphicData>
+            </a:graphic>
+            <wp14:sizeRelH relativeFrom="page">
+              <wp14:pctWidth>0</wp14:pctWidth>
+            </wp14:sizeRelH>
+            <wp14:sizeRelV relativeFrom="page">
+              <wp14:pctHeight>0</wp14:pctHeight>
+            </wp14:sizeRelV>
+          </wp:anchor>
+        </w:drawing>
+      </w:r>
+      <w:r>
+        <w:rPr>
+          <w:noProof/>
+        </w:rPr>
+        <w:drawing>
+          <wp:inline distT="0" distB="0" distL="0" distR="0" wp14:anchorId="3B4D7E7E" wp14:editId="6C0FDD6B">
+            <wp:extent cx="3764477" cy="410189"/>
+            <wp:effectExtent l="0" t="0" r="0" b="9525"/>
+            <wp:docPr id="4" name="Рисунок 4"/>
+            <wp:cNvGraphicFramePr>
+              <a:graphicFrameLocks xmlns:a="http://schemas.openxmlformats.org/drawingml/2006/main" noChangeAspect="1"/>
+            </wp:cNvGraphicFramePr>
+            <a:graphic xmlns:a="http://schemas.openxmlformats.org/drawingml/2006/main">
+              <a:graphicData uri="http://schemas.openxmlformats.org/drawingml/2006/picture">
+                <pic:pic xmlns:pic="http://schemas.openxmlformats.org/drawingml/2006/picture">
+                  <pic:nvPicPr>
+                    <pic:cNvPr id="1" name=""/>
+                    <pic:cNvPicPr/>
+                  </pic:nvPicPr>
+                  <pic:blipFill>
+                    <a:blip r:embed="rId16"/>
+                    <a:stretch>
+                      <a:fillRect/>
+                    </a:stretch>
+                  </pic:blipFill>
+                  <pic:spPr>
+                    <a:xfrm>
+                      <a:off x="0" y="0"/>
+                      <a:ext cx="3936481" cy="428931"/>
+                    </a:xfrm>
+                    <a:prstGeom prst="rect">
+                      <a:avLst/>
+                    </a:prstGeom>
+                  </pic:spPr>
+                </pic:pic>
+              </a:graphicData>
+            </a:graphic>
+          </wp:inline>
+        </w:drawing>
+      </w:r>
+    </w:p>
+    <w:p>
+      <w:pPr>
+        <w:ind w:firstLine="0"/>
+        <w:rPr>
+          <w:lang w:val="ru-RU" w:eastAsia="ru-RU"/>
+        </w:rPr>
+      </w:pPr>
+      <w:r>
+        <w:rPr>
+          <w:lang w:val="ru-RU" w:eastAsia="ru-RU"/>
+        </w:rPr>
+        <w:t>То есть, амплитуда сигнала</w:t>
+      </w:r>
+      <w:r>
+        <w:rPr>
+          <w:lang w:val="ru-RU" w:eastAsia="ru-RU"/>
+        </w:rPr>
+        <w:t xml:space="preserve"> </w:t>
+      </w:r>
+      <w:r>
+        <w:rPr>
+          <w:lang w:val="ru-RU" w:eastAsia="ru-RU"/>
+        </w:rPr>
+        <w:t xml:space="preserve">на частотах </w:t>
+      </w:r>
+      <w:r>
+        <w:rPr>
+          <w:lang w:eastAsia="ru-RU"/>
+        </w:rPr>
+        <w:t>f</w:t>
+      </w:r>
+      <w:r>
+        <w:rPr>
+          <w:lang w:val="ru-RU" w:eastAsia="ru-RU"/>
+        </w:rPr>
+        <w:t xml:space="preserve">1 </w:t>
+      </w:r>
+      <w:r>
+        <w:rPr>
+          <w:lang w:val="ru-RU" w:eastAsia="ru-RU"/>
+        </w:rPr>
+        <w:t xml:space="preserve">и </w:t>
+      </w:r>
+      <w:r>
+        <w:rPr>
+          <w:lang w:eastAsia="ru-RU"/>
+        </w:rPr>
+        <w:t>f</w:t>
+      </w:r>
+      <w:r>
+        <w:rPr>
+          <w:lang w:val="ru-RU" w:eastAsia="ru-RU"/>
+        </w:rPr>
+        <w:t>2</w:t>
+      </w:r>
+      <w:r>
+        <w:rPr>
+          <w:lang w:val="ru-RU" w:eastAsia="ru-RU"/>
+        </w:rPr>
+        <w:t xml:space="preserve"> на выходе</w:t>
+      </w:r>
+      <w:r>
+        <w:rPr>
+          <w:lang w:val="ru-RU" w:eastAsia="ru-RU"/>
+        </w:rPr>
+        <w:t xml:space="preserve">: </w:t>
+      </w:r>
+    </w:p>
+    <w:p>
+      <w:pPr>
+        <w:rPr>
+          <w:lang w:val="ru-RU" w:eastAsia="ru-RU"/>
+        </w:rPr>
+      </w:pPr>
+      <w:r>
+        <w:rPr>
+          <w:noProof/>
+        </w:rPr>
+        <w:drawing>
+          <wp:anchor distT="0" distB="0" distL="114300" distR="114300" simplePos="0" relativeHeight="251659264" behindDoc="0" locked="0" layoutInCell="1" allowOverlap="1" wp14:anchorId="1762508B" wp14:editId="36C9B0D2">
+            <wp:simplePos x="0" y="0"/>
+            <wp:positionH relativeFrom="column">
+              <wp:posOffset>3256915</wp:posOffset>
+            </wp:positionH>
+            <wp:positionV relativeFrom="paragraph">
+              <wp:posOffset>97804</wp:posOffset>
+            </wp:positionV>
+            <wp:extent cx="2417542" cy="362585"/>
+            <wp:effectExtent l="0" t="0" r="1905" b="0"/>
+            <wp:wrapNone/>
+            <wp:docPr id="9" name="Рисунок 9"/>
+            <wp:cNvGraphicFramePr>
+              <a:graphicFrameLocks xmlns:a="http://schemas.openxmlformats.org/drawingml/2006/main" noChangeAspect="1"/>
+            </wp:cNvGraphicFramePr>
+            <a:graphic xmlns:a="http://schemas.openxmlformats.org/drawingml/2006/main">
+              <a:graphicData uri="http://schemas.openxmlformats.org/drawingml/2006/picture">
+                <pic:pic xmlns:pic="http://schemas.openxmlformats.org/drawingml/2006/picture">
+                  <pic:nvPicPr>
+                    <pic:cNvPr id="1" name=""/>
+                    <pic:cNvPicPr/>
+                  </pic:nvPicPr>
+                  <pic:blipFill>
+                    <a:blip r:embed="rId17"/>
+                    <a:stretch>
+                      <a:fillRect/>
+                    </a:stretch>
+                  </pic:blipFill>
+                  <pic:spPr>
+                    <a:xfrm>
+                      <a:off x="0" y="0"/>
+                      <a:ext cx="2417542" cy="362585"/>
+                    </a:xfrm>
+                    <a:prstGeom prst="rect">
+                      <a:avLst/>
+                    </a:prstGeom>
+                  </pic:spPr>
+                </pic:pic>
+              </a:graphicData>
+            </a:graphic>
+            <wp14:sizeRelH relativeFrom="page">
+              <wp14:pctWidth>0</wp14:pctWidth>
+            </wp14:sizeRelH>
+            <wp14:sizeRelV relativeFrom="page">
+              <wp14:pctHeight>0</wp14:pctHeight>
+            </wp14:sizeRelV>
+          </wp:anchor>
+        </w:drawing>
+      </w:r>
+      <w:r>
+        <w:rPr>
+          <w:lang w:val="ru-RU" w:eastAsia="ru-RU"/>
+        </w:rPr>
+        <w:t>В пересчете на мощность</w:t>
+      </w:r>
+      <w:r>
+        <w:rPr>
+          <w:lang w:val="ru-RU" w:eastAsia="ru-RU"/>
+        </w:rPr>
+        <w:t>:</w:t>
+      </w:r>
+    </w:p>
+    <w:p>
+      <w:pPr>
+        <w:ind w:firstLine="0"/>
+        <w:rPr>
+          <w:lang w:val="ru-RU" w:eastAsia="ru-RU"/>
+        </w:rPr>
+      </w:pPr>
+      <w:r>
+        <w:rPr>
+          <w:noProof/>
+        </w:rPr>
+        <w:drawing>
+          <wp:anchor distT="0" distB="0" distL="114300" distR="114300" simplePos="0" relativeHeight="251660288" behindDoc="0" locked="0" layoutInCell="1" allowOverlap="1" wp14:anchorId="00A0ECA4" wp14:editId="6FAC91DA">
+            <wp:simplePos x="0" y="0"/>
+            <wp:positionH relativeFrom="column">
+              <wp:posOffset>1948815</wp:posOffset>
+            </wp:positionH>
+            <wp:positionV relativeFrom="paragraph">
+              <wp:posOffset>182245</wp:posOffset>
+            </wp:positionV>
+            <wp:extent cx="598170" cy="225425"/>
+            <wp:effectExtent l="0" t="0" r="0" b="3175"/>
+            <wp:wrapNone/>
+            <wp:docPr id="10" name="Рисунок 10"/>
+            <wp:cNvGraphicFramePr>
+              <a:graphicFrameLocks xmlns:a="http://schemas.openxmlformats.org/drawingml/2006/main" noChangeAspect="1"/>
+            </wp:cNvGraphicFramePr>
+            <a:graphic xmlns:a="http://schemas.openxmlformats.org/drawingml/2006/main">
+              <a:graphicData uri="http://schemas.openxmlformats.org/drawingml/2006/picture">
+                <pic:pic xmlns:pic="http://schemas.openxmlformats.org/drawingml/2006/picture">
+                  <pic:nvPicPr>
+                    <pic:cNvPr id="1" name=""/>
+                    <pic:cNvPicPr/>
+                  </pic:nvPicPr>
+                  <pic:blipFill rotWithShape="1">
+                    <a:blip r:embed="rId18"/>
+                    <a:srcRect t="9140" b="8536"/>
+                    <a:stretch/>
+                  </pic:blipFill>
+                  <pic:spPr bwMode="auto">
+                    <a:xfrm>
+                      <a:off x="0" y="0"/>
+                      <a:ext cx="598170" cy="225425"/>
+                    </a:xfrm>
+                    <a:prstGeom prst="rect">
+                      <a:avLst/>
+                    </a:prstGeom>
+                    <a:ln>
+                      <a:noFill/>
+                    </a:ln>
+                    <a:extLst>
+                      <a:ext uri="{53640926-AAD7-44D8-BBD7-CCE9431645EC}">
+                        <a14:shadowObscured xmlns:a14="http://schemas.microsoft.com/office/drawing/2010/main"/>
+                      </a:ext>
+                    </a:extLst>
+                  </pic:spPr>
+                </pic:pic>
+              </a:graphicData>
+            </a:graphic>
+            <wp14:sizeRelH relativeFrom="page">
+              <wp14:pctWidth>0</wp14:pctWidth>
+            </wp14:sizeRelH>
+            <wp14:sizeRelV relativeFrom="page">
+              <wp14:pctHeight>0</wp14:pctHeight>
+            </wp14:sizeRelV>
+          </wp:anchor>
+        </w:drawing>
+      </w:r>
+      <w:r>
+        <w:rPr>
+          <w:lang w:val="ru-RU" w:eastAsia="ru-RU"/>
+        </w:rPr>
+        <w:t xml:space="preserve">Мощность </w:t>
+      </w:r>
+      <w:r>
+        <w:rPr>
+          <w:lang w:val="ru-RU" w:eastAsia="ru-RU"/>
+        </w:rPr>
+        <w:t>сигнала</w:t>
+      </w:r>
+      <w:r>
+        <w:rPr>
+          <w:lang w:val="ru-RU" w:eastAsia="ru-RU"/>
+        </w:rPr>
+        <w:t xml:space="preserve"> </w:t>
+      </w:r>
+      <w:r>
+        <w:rPr>
+          <w:lang w:val="ru-RU" w:eastAsia="ru-RU"/>
+        </w:rPr>
+        <w:t xml:space="preserve">на частотах </w:t>
+      </w:r>
+      <w:r>
+        <w:rPr>
+          <w:lang w:eastAsia="ru-RU"/>
+        </w:rPr>
+        <w:t>f</w:t>
+      </w:r>
+      <w:r>
+        <w:rPr>
+          <w:lang w:val="ru-RU" w:eastAsia="ru-RU"/>
+        </w:rPr>
+        <w:t xml:space="preserve">1 </w:t>
+      </w:r>
+      <w:r>
+        <w:rPr>
+          <w:lang w:val="ru-RU" w:eastAsia="ru-RU"/>
+        </w:rPr>
+        <w:t xml:space="preserve">и </w:t>
+      </w:r>
+      <w:r>
+        <w:rPr>
+          <w:lang w:eastAsia="ru-RU"/>
+        </w:rPr>
+        <w:t>f</w:t>
+      </w:r>
+      <w:r>
+        <w:rPr>
+          <w:lang w:val="ru-RU" w:eastAsia="ru-RU"/>
+        </w:rPr>
+        <w:t>2</w:t>
+      </w:r>
+      <w:r>
+        <w:rPr>
+          <w:lang w:val="ru-RU" w:eastAsia="ru-RU"/>
+        </w:rPr>
+        <w:t xml:space="preserve"> </w:t>
+      </w:r>
+      <w:r>
+        <w:rPr>
+          <w:lang w:val="ru-RU" w:eastAsia="ru-RU"/>
+        </w:rPr>
+        <w:t>на выходе</w:t>
+      </w:r>
+      <w:r>
+        <w:rPr>
+          <w:lang w:val="ru-RU" w:eastAsia="ru-RU"/>
+        </w:rPr>
+        <w:t xml:space="preserve">: </w:t>
+      </w:r>
+    </w:p>
+    <w:p>
+      <w:pPr>
+        <w:ind w:firstLine="0"/>
+        <w:rPr>
+          <w:lang w:val="ru-RU" w:eastAsia="ru-RU"/>
+        </w:rPr>
+      </w:pPr>
+      <w:r>
+        <w:rPr>
+          <w:lang w:val="ru-RU" w:eastAsia="ru-RU"/>
+        </w:rPr>
+        <w:t>Мощность входного сигнала</w:t>
+      </w:r>
+      <w:r>
+        <w:rPr>
+          <w:lang w:val="ru-RU" w:eastAsia="ru-RU"/>
+        </w:rPr>
+        <w:t xml:space="preserve">: </w:t>
+      </w:r>
+    </w:p>
+    <w:p>
+      <w:pPr>
+        <w:ind w:firstLine="0"/>
+        <w:rPr>
+          <w:sz w:val="21"/>
+          <w:lang w:val="ru-RU" w:eastAsia="ru-RU"/>
+        </w:rPr>
+      </w:pPr>
+      <w:r>
+        <w:rPr>
+          <w:lang w:val="ru-RU" w:eastAsia="ru-RU"/>
+        </w:rPr>
+        <w:t xml:space="preserve">А из в таблице 2 мы видим, </w:t>
+      </w:r>
+      <w:r>
+        <w:rPr>
+          <w:szCs w:val="24"/>
+          <w:lang w:val="ru-RU" w:eastAsia="ru-RU"/>
+        </w:rPr>
+        <w:t xml:space="preserve">что </w:t>
+      </w:r>
+      <w:r>
+        <w:rPr>
+          <w:szCs w:val="24"/>
+          <w:lang w:val="ru-RU" w:eastAsia="ru-RU"/>
+        </w:rPr>
+        <w:t>P_f1,2</w:t>
+      </w:r>
+      <w:r>
+        <w:rPr>
+          <w:szCs w:val="24"/>
+          <w:lang w:val="ru-RU" w:eastAsia="ru-RU"/>
+        </w:rPr>
+        <w:t xml:space="preserve"> =</w:t>
+      </w:r>
+      <w:r>
+        <w:rPr>
+          <w:szCs w:val="28"/>
+          <w:lang w:val="ru-RU" w:eastAsia="ru-RU"/>
+        </w:rPr>
+        <w:t xml:space="preserve"> </w:t>
+      </w:r>
+      <w:r>
+        <w:rPr>
+          <w:sz w:val="21"/>
+          <w:lang w:val="ru-RU" w:eastAsia="ru-RU"/>
+        </w:rPr>
+        <w:t>G₁²P_C</w:t>
+      </w:r>
+      <w:r>
+        <w:rPr>
+          <w:sz w:val="21"/>
+          <w:lang w:val="ru-RU" w:eastAsia="ru-RU"/>
+        </w:rPr>
+        <w:t>, то есть еще два слагаемых не учитываются.</w:t>
+      </w:r>
+    </w:p>
+    <w:p>
+      <w:pPr>
+        <w:rPr>
+          <w:lang w:val="ru-RU" w:eastAsia="ru-RU"/>
+        </w:rPr>
+      </w:pPr>
+      <w:r>
+        <w:rPr>
+          <w:lang w:val="ru-RU" w:eastAsia="ru-RU"/>
+        </w:rPr>
+        <w:t xml:space="preserve">Все потому, что мы говорим о малых сигналах и </w:t>
+      </w:r>
+      <w:r>
+        <w:rPr>
+          <w:lang w:eastAsia="ru-RU"/>
+        </w:rPr>
+        <w:t>P</w:t>
+      </w:r>
+      <w:r>
+        <w:rPr>
+          <w:lang w:val="ru-RU" w:eastAsia="ru-RU"/>
+        </w:rPr>
+        <w:t>_</w:t>
+      </w:r>
+      <w:r>
+        <w:rPr>
+          <w:lang w:eastAsia="ru-RU"/>
+        </w:rPr>
+        <w:t>C</w:t>
+      </w:r>
+      <w:r>
+        <w:rPr>
+          <w:lang w:val="ru-RU" w:eastAsia="ru-RU"/>
+        </w:rPr>
+        <w:t xml:space="preserve"> </w:t>
+      </w:r>
+      <w:r>
+        <w:rPr>
+          <w:lang w:val="ru-RU" w:eastAsia="ru-RU"/>
+        </w:rPr>
+        <w:t>мало, поэтому мы пр</w:t>
+      </w:r>
+      <w:r>
+        <w:rPr>
+          <w:lang w:val="ru-RU" w:eastAsia="ru-RU"/>
+        </w:rPr>
+        <w:t>е</w:t>
+      </w:r>
+      <w:r>
+        <w:rPr>
+          <w:lang w:val="ru-RU" w:eastAsia="ru-RU"/>
+        </w:rPr>
+        <w:t>не</w:t>
+      </w:r>
+      <w:r>
+        <w:rPr>
+          <w:lang w:val="ru-RU" w:eastAsia="ru-RU"/>
+        </w:rPr>
+        <w:t>б</w:t>
+      </w:r>
+      <w:r>
+        <w:rPr>
+          <w:lang w:val="ru-RU" w:eastAsia="ru-RU"/>
+        </w:rPr>
+        <w:t>регаем</w:t>
+      </w:r>
+      <w:r>
+        <w:rPr>
+          <w:lang w:val="ru-RU" w:eastAsia="ru-RU"/>
+        </w:rPr>
+        <w:t xml:space="preserve"> последними двумя слагаемыми.</w:t>
+      </w:r>
+    </w:p>
+    <w:p>
+      <w:pPr>
+        <w:rPr>
+          <w:lang w:val="ru-RU" w:eastAsia="ru-RU"/>
+        </w:rPr>
+      </w:pPr>
+    </w:p>
+    <w:p>
+      <w:pPr>
+        <w:rPr>
+          <w:lang w:val="ru-RU" w:eastAsia="ru-RU"/>
+        </w:rPr>
+      </w:pPr>
+    </w:p>
+    <w:p>
+      <w:pPr>
+        <w:ind w:firstLine="0"/>
+        <w:rPr>
+          <w:lang w:val="ru-RU" w:eastAsia="ru-RU"/>
+        </w:rPr>
+      </w:pPr>
+    </w:p>
+    <w:p>
+      <w:pPr>
+        <w:rPr>
+          <w:lang w:val="ru-RU"/>
+        </w:rPr>
+      </w:pPr>
+      <w:r>
+        <w:rPr>
+          <w:lang w:val="ru-RU" w:eastAsia="ru-RU"/>
+        </w:rPr>
+        <w:lastRenderedPageBreak/>
+        <w:t xml:space="preserve"> Как и следовало ожидать, наклон зависимости усиленного сигнала равен 1:1, продуктов нелинейности второго порядка – 2:1, третьего – 3:1. Это означает, что при каждом уменьшении мощности входного сигнала на 1 dB, отношение мощности выходного сигнала и искажений второго порядка увеличивается на 1 dB, а для третьего порядка – на 2 dB. Следует учесть, что указанные зависимости справедливы лишь для малых сигналов (как правило, ниже точки децибельной компрессии на 6-10 dB).</w:t>
+      </w:r>
+    </w:p>
+    <w:p>
+      <w:pPr>
+        <w:jc w:val="center"/>
+      </w:pPr>
+      <w:r>
+        <w:rPr>
+          <w:noProof/>
+          <w:lang w:val="ru-RU" w:eastAsia="ru-RU"/>
+        </w:rPr>
+        <w:drawing>
+          <wp:inline distT="0" distB="0" distL="0" distR="0" wp14:anchorId="4F620F08" wp14:editId="7FE77B19">
+            <wp:extent cx="3780000" cy="1841538"/>
+            <wp:effectExtent l="0" t="0" r="0" b="0"/>
+            <wp:docPr id="20" name="Picture 20"/>
+            <wp:cNvGraphicFramePr>
+              <a:graphicFrameLocks xmlns:a="http://schemas.openxmlformats.org/drawingml/2006/main" noChangeAspect="1"/>
+            </wp:cNvGraphicFramePr>
+            <a:graphic xmlns:a="http://schemas.openxmlformats.org/drawingml/2006/main">
+              <a:graphicData uri="http://schemas.openxmlformats.org/drawingml/2006/picture">
+                <pic:pic xmlns:pic="http://schemas.openxmlformats.org/drawingml/2006/picture">
+                  <pic:nvPicPr>
+                    <pic:cNvPr id="0" name="fig4.png"/>
+                    <pic:cNvPicPr/>
+                  </pic:nvPicPr>
+                  <pic:blipFill>
+                    <a:blip r:embed="rId19"/>
+                    <a:stretch>
+                      <a:fillRect/>
+                    </a:stretch>
+                  </pic:blipFill>
+                  <pic:spPr>
+                    <a:xfrm>
+                      <a:off x="0" y="0"/>
+                      <a:ext cx="3780000" cy="1841538"/>
+                    </a:xfrm>
+                    <a:prstGeom prst="rect">
+                      <a:avLst/>
+                    </a:prstGeom>
+                  </pic:spPr>
+                </pic:pic>
+              </a:graphicData>
+            </a:graphic>
+          </wp:inline>
+        </w:drawing>
+      </w:r>
+    </w:p>
+    <w:p>
+      <w:pPr>
+        <w:pStyle w:val="FigureCaptionLab"/>
+        <w:rPr>
+          <w:lang w:val="ru-RU"/>
+        </w:rPr>
+      </w:pPr>
+      <w:r>
+        <w:rPr>
+          <w:lang w:val="ru-RU" w:eastAsia="ru-RU"/>
+        </w:rPr>
+        <w:t>Рис. 4: Зависимость уровня продуктов нелинейных искажений от мощности тона входного двухтонального сигнала</w:t>
+      </w:r>
+    </w:p>
+    <w:p>
+      <w:pPr>
+        <w:rPr>
+          <w:lang w:val="ru-RU" w:eastAsia="ru-RU"/>
+        </w:rPr>
+      </w:pPr>
+      <w:r>
+        <w:rPr>
+          <w:lang w:val="ru-RU" w:eastAsia="ru-RU"/>
+        </w:rPr>
+        <w:t>Точкой пересечения интермодуляции второго порядка по входу IIP2 (Input IP2) для двухтонального сигнала с частотами f₁ и f₂ и одинаковыми уровнями тонов называется такая мощность тона входного сигнала, при котором аппроксимированные выходные мощности усиленного тона и продуктов нелинейности второго порядка на частоте f₂ − f₁ (или f₂ + f₁) равны.</w:t>
+      </w:r>
+    </w:p>
+    <w:p>
+      <w:pPr>
+        <w:jc w:val="center"/>
+      </w:pPr>
+      <w:r>
+        <w:rPr>
+          <w:noProof/>
+        </w:rPr>
+        <w:drawing>
+          <wp:inline distT="0" distB="0" distL="0" distR="0" wp14:anchorId="28DFB5BE" wp14:editId="294BF046">
+            <wp:extent cx="3248478" cy="2591162"/>
+            <wp:effectExtent l="0" t="0" r="0" b="0"/>
+            <wp:docPr id="1" name="Рисунок 1"/>
+            <wp:cNvGraphicFramePr>
+              <a:graphicFrameLocks xmlns:a="http://schemas.openxmlformats.org/drawingml/2006/main" noChangeAspect="1"/>
+            </wp:cNvGraphicFramePr>
+            <a:graphic xmlns:a="http://schemas.openxmlformats.org/drawingml/2006/main">
+              <a:graphicData uri="http://schemas.openxmlformats.org/drawingml/2006/picture">
+                <pic:pic xmlns:pic="http://schemas.openxmlformats.org/drawingml/2006/picture">
+                  <pic:nvPicPr>
+                    <pic:cNvPr id="1" name=""/>
+                    <pic:cNvPicPr/>
+                  </pic:nvPicPr>
+                  <pic:blipFill>
+                    <a:blip r:embed="rId20"/>
+                    <a:stretch>
+                      <a:fillRect/>
+                    </a:stretch>
+                  </pic:blipFill>
+                  <pic:spPr>
+                    <a:xfrm>
+                      <a:off x="0" y="0"/>
                       <a:ext cx="3248478" cy="2591162"/>
                     </a:xfrm>
                     <a:prstGeom prst="rect">
@@ -4818,49 +5204,7 @@
         <w:rPr>
           <w:lang w:val="ru-RU" w:eastAsia="ru-RU"/>
         </w:rPr>
-        <w:t xml:space="preserve">Точкой пересечения </w:t>
-      </w:r>
-      <w:proofErr w:type="spellStart"/>
-      <w:r>
-        <w:rPr>
-          <w:lang w:val="ru-RU" w:eastAsia="ru-RU"/>
-        </w:rPr>
-        <w:t>интермодуляции</w:t>
-      </w:r>
-      <w:proofErr w:type="spellEnd"/>
-      <w:r>
-        <w:rPr>
-          <w:lang w:val="ru-RU" w:eastAsia="ru-RU"/>
-        </w:rPr>
-        <w:t xml:space="preserve"> второго порядка по выходу OIP2 (</w:t>
-      </w:r>
-      <w:proofErr w:type="spellStart"/>
-      <w:r>
-        <w:rPr>
-          <w:lang w:val="ru-RU" w:eastAsia="ru-RU"/>
-        </w:rPr>
-        <w:t>Output</w:t>
-      </w:r>
-      <w:proofErr w:type="spellEnd"/>
-      <w:r>
-        <w:rPr>
-          <w:lang w:val="ru-RU" w:eastAsia="ru-RU"/>
-        </w:rPr>
-        <w:t xml:space="preserve"> IP2) для </w:t>
-      </w:r>
-      <w:proofErr w:type="spellStart"/>
-      <w:r>
-        <w:rPr>
-          <w:lang w:val="ru-RU" w:eastAsia="ru-RU"/>
-        </w:rPr>
-        <w:t>двухтонального</w:t>
-      </w:r>
-      <w:proofErr w:type="spellEnd"/>
-      <w:r>
-        <w:rPr>
-          <w:lang w:val="ru-RU" w:eastAsia="ru-RU"/>
-        </w:rPr>
-        <w:t xml:space="preserve"> сигнала с частотами f₁ и f₂ и одинаковыми уровнями тонов называется такая аппроксимированная мощность тона выходного сигнала, при которой она равна мощности продукта нелинейности второго порядка на частоте f₂ − f₁ (или f₂ + f₁).</w:t>
+        <w:t>Точкой пересечения интермодуляции второго порядка по выходу OIP2 (Output IP2) для двухтонального сигнала с частотами f₁ и f₂ и одинаковыми уровнями тонов называется такая аппроксимированная мощность тона выходного сигнала, при которой она равна мощности продукта нелинейности второго порядка на частоте f₂ − f₁ (или f₂ + f₁).</w:t>
       </w:r>
     </w:p>
     <w:p>
@@ -5002,6 +5346,7 @@
         <w:rPr>
           <w:lang w:val="ru-RU" w:eastAsia="ru-RU"/>
         </w:rPr>
+        <w:lastRenderedPageBreak/>
         <w:t>где P_f1,2 – мощность тона выходного сигнала, IM₂ – продукта нелинейности второго порядка на частоте f₂ ± f₁, рис. 5.</w:t>
       </w:r>
     </w:p>
@@ -5015,35 +5360,7 @@
         <w:rPr>
           <w:lang w:val="ru-RU" w:eastAsia="ru-RU"/>
         </w:rPr>
-        <w:t xml:space="preserve">Точкой пересечения </w:t>
-      </w:r>
-      <w:proofErr w:type="spellStart"/>
-      <w:r>
-        <w:rPr>
-          <w:lang w:val="ru-RU" w:eastAsia="ru-RU"/>
-        </w:rPr>
-        <w:t>интермодуляции</w:t>
-      </w:r>
-      <w:proofErr w:type="spellEnd"/>
-      <w:r>
-        <w:rPr>
-          <w:lang w:val="ru-RU" w:eastAsia="ru-RU"/>
-        </w:rPr>
-        <w:t xml:space="preserve"> второго порядка по входу IIP2 (</w:t>
-      </w:r>
-      <w:proofErr w:type="spellStart"/>
-      <w:r>
-        <w:rPr>
-          <w:lang w:val="ru-RU" w:eastAsia="ru-RU"/>
-        </w:rPr>
-        <w:t>Input</w:t>
-      </w:r>
-      <w:proofErr w:type="spellEnd"/>
-      <w:r>
-        <w:rPr>
-          <w:lang w:val="ru-RU" w:eastAsia="ru-RU"/>
-        </w:rPr>
-        <w:t xml:space="preserve"> IP2) называется мощность входного тона, соответствующая мощности OIP2 на выходе.</w:t>
+        <w:t>Точкой пересечения интермодуляции второго порядка по входу IIP2 (Input IP2) называется мощность входного тона, соответствующая мощности OIP2 на выходе.</w:t>
       </w:r>
     </w:p>
     <w:p>
@@ -5155,49 +5472,7 @@
         <w:rPr>
           <w:lang w:val="ru-RU" w:eastAsia="ru-RU"/>
         </w:rPr>
-        <w:t xml:space="preserve">Точкой пересечения </w:t>
-      </w:r>
-      <w:proofErr w:type="spellStart"/>
-      <w:r>
-        <w:rPr>
-          <w:lang w:val="ru-RU" w:eastAsia="ru-RU"/>
-        </w:rPr>
-        <w:t>интермодуляции</w:t>
-      </w:r>
-      <w:proofErr w:type="spellEnd"/>
-      <w:r>
-        <w:rPr>
-          <w:lang w:val="ru-RU" w:eastAsia="ru-RU"/>
-        </w:rPr>
-        <w:t xml:space="preserve"> третьего порядка по выходу OIP3 (</w:t>
-      </w:r>
-      <w:proofErr w:type="spellStart"/>
-      <w:r>
-        <w:rPr>
-          <w:lang w:val="ru-RU" w:eastAsia="ru-RU"/>
-        </w:rPr>
-        <w:t>Output</w:t>
-      </w:r>
-      <w:proofErr w:type="spellEnd"/>
-      <w:r>
-        <w:rPr>
-          <w:lang w:val="ru-RU" w:eastAsia="ru-RU"/>
-        </w:rPr>
-        <w:t xml:space="preserve"> IP3) для </w:t>
-      </w:r>
-      <w:proofErr w:type="spellStart"/>
-      <w:r>
-        <w:rPr>
-          <w:lang w:val="ru-RU" w:eastAsia="ru-RU"/>
-        </w:rPr>
-        <w:t>двухтонального</w:t>
-      </w:r>
-      <w:proofErr w:type="spellEnd"/>
-      <w:r>
-        <w:rPr>
-          <w:lang w:val="ru-RU" w:eastAsia="ru-RU"/>
-        </w:rPr>
-        <w:t xml:space="preserve"> сигнала с частотами f₁ и f₂ и одинаковыми уровнями тонов называется такая аппроксимированная мощность тона выходного сигнала, при которой она равна мощности продукта нелинейности третьего порядка на частоте 2f₂−f₁ (или 2f₁ − f₂).</w:t>
+        <w:t>Точкой пересечения интермодуляции третьего порядка по выходу OIP3 (Output IP3) для двухтонального сигнала с частотами f₁ и f₂ и одинаковыми уровнями тонов называется такая аппроксимированная мощность тона выходного сигнала, при которой она равна мощности продукта нелинейности третьего порядка на частоте 2f₂−f₁ (или 2f₁ − f₂).</w:t>
       </w:r>
     </w:p>
     <w:p>
@@ -5368,35 +5643,7 @@
         <w:rPr>
           <w:lang w:val="ru-RU" w:eastAsia="ru-RU"/>
         </w:rPr>
-        <w:t xml:space="preserve">Точкой пересечения </w:t>
-      </w:r>
-      <w:proofErr w:type="spellStart"/>
-      <w:r>
-        <w:rPr>
-          <w:lang w:val="ru-RU" w:eastAsia="ru-RU"/>
-        </w:rPr>
-        <w:t>интермодуляции</w:t>
-      </w:r>
-      <w:proofErr w:type="spellEnd"/>
-      <w:r>
-        <w:rPr>
-          <w:lang w:val="ru-RU" w:eastAsia="ru-RU"/>
-        </w:rPr>
-        <w:t xml:space="preserve"> третьего порядка по входу IIP3 (</w:t>
-      </w:r>
-      <w:proofErr w:type="spellStart"/>
-      <w:r>
-        <w:rPr>
-          <w:lang w:val="ru-RU" w:eastAsia="ru-RU"/>
-        </w:rPr>
-        <w:t>Input</w:t>
-      </w:r>
-      <w:proofErr w:type="spellEnd"/>
-      <w:r>
-        <w:rPr>
-          <w:lang w:val="ru-RU" w:eastAsia="ru-RU"/>
-        </w:rPr>
-        <w:t xml:space="preserve"> IP3) называется мощность входного тона, соответствующая мощности OIP3 на выходе.</w:t>
+        <w:t>Точкой пересечения интермодуляции третьего порядка по входу IIP3 (Input IP3) называется мощность входного тона, соответствующая мощности OIP3 на выходе.</w:t>
       </w:r>
     </w:p>
     <w:p>
@@ -5501,7 +5748,7 @@
     <w:p>
       <w:pPr>
         <w:rPr>
-          <w:lang w:val="ru-RU" w:eastAsia="ru-RU"/>
+          <w:lang w:val="ru-RU"/>
         </w:rPr>
       </w:pPr>
       <w:r>
@@ -5510,19 +5757,6 @@
         </w:rPr>
         <w:t>Следует отметить, что параметры IP2 и IP3 имеют размерность мощности. Для логарифмических величин, выраженных в децибелах, соотношения (6, 7, 8, 9) принимают следующий вид:</w:t>
       </w:r>
-      <w:r>
-        <w:rPr>
-          <w:lang w:val="ru-RU" w:eastAsia="ru-RU"/>
-        </w:rPr>
-        <w:br w:type="page"/>
-      </w:r>
-    </w:p>
-    <w:p>
-      <w:pPr>
-        <w:rPr>
-          <w:lang w:val="ru-RU"/>
-        </w:rPr>
-      </w:pPr>
     </w:p>
     <w:p>
       <w:pPr>
@@ -5554,23 +5788,23 @@
           <w:sz w:val="23"/>
           <w:lang w:val="ru-RU" w:eastAsia="ru-RU"/>
         </w:rPr>
-        <w:t>[</w:t>
-      </w:r>
-      <w:proofErr w:type="spellStart"/>
+        <w:t>[dB]</w:t>
+      </w:r>
       <w:r>
         <w:rPr>
           <w:sz w:val="23"/>
           <w:lang w:val="ru-RU" w:eastAsia="ru-RU"/>
         </w:rPr>
-        <w:t>dB</w:t>
-      </w:r>
-      <w:proofErr w:type="spellEnd"/>
+        <w:br/>
+        <w:t>OIP₂ = IIP₂ + G₁,   [dB]</w:t>
+      </w:r>
       <w:r>
         <w:rPr>
           <w:sz w:val="23"/>
           <w:lang w:val="ru-RU" w:eastAsia="ru-RU"/>
         </w:rPr>
-        <w:t>]</w:t>
+        <w:br/>
+        <w:t>IMD₃ = 2(OIP₂ − P_f1,2),   [dB]</w:t>
       </w:r>
       <w:r>
         <w:rPr>
@@ -5578,71 +5812,7 @@
           <w:lang w:val="ru-RU" w:eastAsia="ru-RU"/>
         </w:rPr>
         <w:br/>
-        <w:t>OIP₂ = IIP₂ + G₁,   [</w:t>
-      </w:r>
-      <w:proofErr w:type="spellStart"/>
-      <w:r>
-        <w:rPr>
-          <w:sz w:val="23"/>
-          <w:lang w:val="ru-RU" w:eastAsia="ru-RU"/>
-        </w:rPr>
-        <w:t>dB</w:t>
-      </w:r>
-      <w:proofErr w:type="spellEnd"/>
-      <w:r>
-        <w:rPr>
-          <w:sz w:val="23"/>
-          <w:lang w:val="ru-RU" w:eastAsia="ru-RU"/>
-        </w:rPr>
-        <w:t>]</w:t>
-      </w:r>
-      <w:r>
-        <w:rPr>
-          <w:sz w:val="23"/>
-          <w:lang w:val="ru-RU" w:eastAsia="ru-RU"/>
-        </w:rPr>
-        <w:br/>
-        <w:t>IMD₃ = 2(OIP₂ − P_f1,2),   [</w:t>
-      </w:r>
-      <w:proofErr w:type="spellStart"/>
-      <w:r>
-        <w:rPr>
-          <w:sz w:val="23"/>
-          <w:lang w:val="ru-RU" w:eastAsia="ru-RU"/>
-        </w:rPr>
-        <w:t>dB</w:t>
-      </w:r>
-      <w:proofErr w:type="spellEnd"/>
-      <w:r>
-        <w:rPr>
-          <w:sz w:val="23"/>
-          <w:lang w:val="ru-RU" w:eastAsia="ru-RU"/>
-        </w:rPr>
-        <w:t>]</w:t>
-      </w:r>
-      <w:r>
-        <w:rPr>
-          <w:sz w:val="23"/>
-          <w:lang w:val="ru-RU" w:eastAsia="ru-RU"/>
-        </w:rPr>
-        <w:br/>
-        <w:t>OIP₃ = IIP₃ + G₁.   [</w:t>
-      </w:r>
-      <w:proofErr w:type="spellStart"/>
-      <w:r>
-        <w:rPr>
-          <w:sz w:val="23"/>
-          <w:lang w:val="ru-RU" w:eastAsia="ru-RU"/>
-        </w:rPr>
-        <w:t>dB</w:t>
-      </w:r>
-      <w:proofErr w:type="spellEnd"/>
-      <w:r>
-        <w:rPr>
-          <w:sz w:val="23"/>
-          <w:lang w:val="ru-RU" w:eastAsia="ru-RU"/>
-        </w:rPr>
-        <w:t>]</w:t>
+        <w:t>OIP₃ = IIP₃ + G₁.   [dB]</w:t>
       </w:r>
     </w:p>
     <w:p>
@@ -5671,21 +5841,7 @@
         <w:rPr>
           <w:lang w:val="ru-RU" w:eastAsia="ru-RU"/>
         </w:rPr>
-        <w:t xml:space="preserve">Приведенные выражения, по сути, определяют методику измерений для </w:t>
-      </w:r>
-      <w:proofErr w:type="spellStart"/>
-      <w:r>
-        <w:rPr>
-          <w:lang w:val="ru-RU" w:eastAsia="ru-RU"/>
-        </w:rPr>
-        <w:t>двухтонального</w:t>
-      </w:r>
-      <w:proofErr w:type="spellEnd"/>
-      <w:r>
-        <w:rPr>
-          <w:lang w:val="ru-RU" w:eastAsia="ru-RU"/>
-        </w:rPr>
-        <w:t xml:space="preserve"> сигнала с одинаковыми уровнями. Однако, не всегда удается получить равные уровни тонов, поэтому желательно получить формулы и для общего случая. Для этого из полученных соотношений выразим коэффициенты G₂ и G₃ через IP2 и IP3, затем с помощью табл. 1 свяжем их с мощностями P_f1 и P_f2.</w:t>
+        <w:t>Приведенные выражения, по сути, определяют методику измерений для двухтонального сигнала с одинаковыми уровнями. Однако, не всегда удается получить равные уровни тонов, поэтому желательно получить формулы и для общего случая. Для этого из полученных соотношений выразим коэффициенты G₂ и G₃ через IP2 и IP3, затем с помощью табл. 1 свяжем их с мощностями P_f1 и P_f2.</w:t>
       </w:r>
     </w:p>
     <w:p>
@@ -6228,71 +6384,23 @@
           <w:sz w:val="23"/>
           <w:lang w:val="ru-RU" w:eastAsia="ru-RU"/>
         </w:rPr>
-        <w:t>[</w:t>
-      </w:r>
-      <w:proofErr w:type="spellStart"/>
+        <w:t>[dB]</w:t>
+      </w:r>
       <w:r>
         <w:rPr>
           <w:sz w:val="23"/>
           <w:lang w:val="ru-RU" w:eastAsia="ru-RU"/>
         </w:rPr>
-        <w:t>dB</w:t>
-      </w:r>
-      <w:proofErr w:type="spellEnd"/>
+        <w:br/>
+        <w:t>OIP₃ = P_f2 + (P_f1 − P_2f2−f1)/2,   [dB]</w:t>
+      </w:r>
       <w:r>
         <w:rPr>
           <w:sz w:val="23"/>
           <w:lang w:val="ru-RU" w:eastAsia="ru-RU"/>
         </w:rPr>
-        <w:t>]</w:t>
-      </w:r>
-      <w:r>
-        <w:rPr>
-          <w:sz w:val="23"/>
-          <w:lang w:val="ru-RU" w:eastAsia="ru-RU"/>
-        </w:rPr>
         <w:br/>
-        <w:t>OIP₃ = P_f2 + (P_f1 − P_2f2−f1)/2,   [</w:t>
-      </w:r>
-      <w:proofErr w:type="spellStart"/>
-      <w:r>
-        <w:rPr>
-          <w:sz w:val="23"/>
-          <w:lang w:val="ru-RU" w:eastAsia="ru-RU"/>
-        </w:rPr>
-        <w:t>dB</w:t>
-      </w:r>
-      <w:proofErr w:type="spellEnd"/>
-      <w:r>
-        <w:rPr>
-          <w:sz w:val="23"/>
-          <w:lang w:val="ru-RU" w:eastAsia="ru-RU"/>
-        </w:rPr>
-        <w:t>]</w:t>
-      </w:r>
-      <w:r>
-        <w:rPr>
-          <w:sz w:val="23"/>
-          <w:lang w:val="ru-RU" w:eastAsia="ru-RU"/>
-        </w:rPr>
-        <w:br/>
-        <w:t>OIP₃ = P_f1 + (P_f2 − P_2f1−f2)/2.   [</w:t>
-      </w:r>
-      <w:proofErr w:type="spellStart"/>
-      <w:r>
-        <w:rPr>
-          <w:sz w:val="23"/>
-          <w:lang w:val="ru-RU" w:eastAsia="ru-RU"/>
-        </w:rPr>
-        <w:t>dB</w:t>
-      </w:r>
-      <w:proofErr w:type="spellEnd"/>
-      <w:r>
-        <w:rPr>
-          <w:sz w:val="23"/>
-          <w:lang w:val="ru-RU" w:eastAsia="ru-RU"/>
-        </w:rPr>
-        <w:t>]</w:t>
+        <w:t>OIP₃ = P_f1 + (P_f2 − P_2f1−f2)/2.   [dB]</w:t>
       </w:r>
     </w:p>
     <w:p>
@@ -6307,23 +6415,7 @@
           <w:rFonts w:ascii="Times New Roman" w:eastAsia="Times New Roman" w:hAnsi="Times New Roman" w:cs="Times New Roman"/>
           <w:lang w:val="ru-RU" w:eastAsia="ru-RU"/>
         </w:rPr>
-        <w:t xml:space="preserve">1.2. Формирование </w:t>
-      </w:r>
-      <w:proofErr w:type="spellStart"/>
-      <w:r>
-        <w:rPr>
-          <w:rFonts w:ascii="Times New Roman" w:eastAsia="Times New Roman" w:hAnsi="Times New Roman" w:cs="Times New Roman"/>
-          <w:lang w:val="ru-RU" w:eastAsia="ru-RU"/>
-        </w:rPr>
-        <w:t>двухтонального</w:t>
-      </w:r>
-      <w:proofErr w:type="spellEnd"/>
-      <w:r>
-        <w:rPr>
-          <w:rFonts w:ascii="Times New Roman" w:eastAsia="Times New Roman" w:hAnsi="Times New Roman" w:cs="Times New Roman"/>
-          <w:lang w:val="ru-RU" w:eastAsia="ru-RU"/>
-        </w:rPr>
-        <w:t xml:space="preserve"> сигнала с помощью сумматора мощности</w:t>
+        <w:t>1.2. Формирование двухтонального сигнала с помощью сумматора мощности</w:t>
       </w:r>
     </w:p>
     <w:p>
@@ -6387,35 +6479,7 @@
         <w:rPr>
           <w:lang w:val="ru-RU" w:eastAsia="ru-RU"/>
         </w:rPr>
-        <w:t xml:space="preserve">Второй вариант схемы формирования сигнала основан на использовании двух источников с близкими частотами и сумматора мощности (Power </w:t>
-      </w:r>
-      <w:proofErr w:type="spellStart"/>
-      <w:r>
-        <w:rPr>
-          <w:lang w:val="ru-RU" w:eastAsia="ru-RU"/>
-        </w:rPr>
-        <w:t>Splitter</w:t>
-      </w:r>
-      <w:proofErr w:type="spellEnd"/>
-      <w:r>
-        <w:rPr>
-          <w:lang w:val="ru-RU" w:eastAsia="ru-RU"/>
-        </w:rPr>
-        <w:t>/</w:t>
-      </w:r>
-      <w:proofErr w:type="spellStart"/>
-      <w:r>
-        <w:rPr>
-          <w:lang w:val="ru-RU" w:eastAsia="ru-RU"/>
-        </w:rPr>
-        <w:t>Combiner</w:t>
-      </w:r>
-      <w:proofErr w:type="spellEnd"/>
-      <w:r>
-        <w:rPr>
-          <w:lang w:val="ru-RU" w:eastAsia="ru-RU"/>
-        </w:rPr>
-        <w:t>), рис.7. Эта схема требует чуть больше оборудования (два высокочастотных генератора вместо одного), но, как будет показано далее, обладает рядом преимуществ перед первым вариантом.</w:t>
+        <w:t>Второй вариант схемы формирования сигнала основан на использовании двух источников с близкими частотами и сумматора мощности (Power Splitter/Combiner), рис.7. Эта схема требует чуть больше оборудования (два высокочастотных генератора вместо одного), но, как будет показано далее, обладает рядом преимуществ перед первым вариантом.</w:t>
       </w:r>
     </w:p>
     <w:p>
@@ -6443,7 +6507,7 @@
                     <pic:cNvPicPr/>
                   </pic:nvPicPr>
                   <pic:blipFill>
-                    <a:blip r:embed="rId16"/>
+                    <a:blip r:embed="rId21"/>
                     <a:stretch>
                       <a:fillRect/>
                     </a:stretch>
@@ -6475,22 +6539,7 @@
         <w:rPr>
           <w:lang w:val="ru-RU" w:eastAsia="ru-RU"/>
         </w:rPr>
-        <w:lastRenderedPageBreak/>
-        <w:t xml:space="preserve">Рис. 7: Формирование </w:t>
-      </w:r>
-      <w:proofErr w:type="spellStart"/>
-      <w:r>
-        <w:rPr>
-          <w:lang w:val="ru-RU" w:eastAsia="ru-RU"/>
-        </w:rPr>
-        <w:t>двухтонального</w:t>
-      </w:r>
-      <w:proofErr w:type="spellEnd"/>
-      <w:r>
-        <w:rPr>
-          <w:lang w:val="ru-RU" w:eastAsia="ru-RU"/>
-        </w:rPr>
-        <w:t xml:space="preserve"> сигнала с помощью сумматора мощности</w:t>
+        <w:t>Рис. 7: Формирование двухтонального сигнала с помощью сумматора мощности</w:t>
       </w:r>
     </w:p>
     <w:p>
@@ -6531,7 +6580,7 @@
                     <pic:cNvPicPr/>
                   </pic:nvPicPr>
                   <pic:blipFill rotWithShape="1">
-                    <a:blip r:embed="rId17"/>
+                    <a:blip r:embed="rId22"/>
                     <a:srcRect l="9290" t="16577" r="-9290" b="-16577"/>
                     <a:stretch/>
                   </pic:blipFill>
@@ -6642,35 +6691,14 @@
         <w:rPr>
           <w:lang w:val="ru-RU" w:eastAsia="ru-RU"/>
         </w:rPr>
-        <w:t xml:space="preserve">Для начала, предположим развязку сумматора достаточно большой и рассмотрим прохождение сигналов с частотами f₁ и f₂ по отдельности. Поскольку источники E1 и E2 формируют сигналы каждый своей частоты, то явление </w:t>
-      </w:r>
-      <w:proofErr w:type="spellStart"/>
-      <w:r>
-        <w:rPr>
-          <w:lang w:val="ru-RU" w:eastAsia="ru-RU"/>
-        </w:rPr>
-        <w:t>интермодуляции</w:t>
-      </w:r>
-      <w:proofErr w:type="spellEnd"/>
-      <w:r>
-        <w:rPr>
-          <w:lang w:val="ru-RU" w:eastAsia="ru-RU"/>
-        </w:rPr>
-        <w:t xml:space="preserve"> на усилителях A1 и A2 при большой изоляции каналов сумматора практически отсутствует. По сути, эти усилители могут работать и в нелинейном режиме, это приведет лишь к увеличенным уровням составляющих на кратных частотах – 2f₁, 2f₂, 3f₁, 3f₂ и т.д. Отметим, что данные частоты не совпадают с частотами интересующих нас продуктов </w:t>
-      </w:r>
-      <w:proofErr w:type="spellStart"/>
-      <w:r>
-        <w:rPr>
-          <w:lang w:val="ru-RU" w:eastAsia="ru-RU"/>
-        </w:rPr>
-        <w:t>интермодуляции</w:t>
-      </w:r>
-      <w:proofErr w:type="spellEnd"/>
-      <w:r>
-        <w:rPr>
-          <w:lang w:val="ru-RU" w:eastAsia="ru-RU"/>
-        </w:rPr>
-        <w:t xml:space="preserve"> IM2 и IM3. Это означает, что можно не предъявлять особых требований к генераторам, входящим в состав схемы измерений.</w:t>
+        <w:t xml:space="preserve">Для начала, предположим развязку сумматора достаточно большой и рассмотрим прохождение сигналов с частотами f₁ и f₂ по отдельности. Поскольку источники E1 и E2 </w:t>
+      </w:r>
+      <w:r>
+        <w:rPr>
+          <w:lang w:val="ru-RU" w:eastAsia="ru-RU"/>
+        </w:rPr>
+        <w:lastRenderedPageBreak/>
+        <w:t>формируют сигналы каждый своей частоты, то явление интермодуляции на усилителях A1 и A2 при большой изоляции каналов сумматора практически отсутствует. По сути, эти усилители могут работать и в нелинейном режиме, это приведет лишь к увеличенным уровням составляющих на кратных частотах – 2f₁, 2f₂, 3f₁, 3f₂ и т.д. Отметим, что данные частоты не совпадают с частотами интересующих нас продуктов интермодуляции IM2 и IM3. Это означает, что можно не предъявлять особых требований к генераторам, входящим в состав схемы измерений.</w:t>
       </w:r>
     </w:p>
     <w:p>
@@ -6683,49 +6711,7 @@
         <w:rPr>
           <w:lang w:val="ru-RU" w:eastAsia="ru-RU"/>
         </w:rPr>
-        <w:t xml:space="preserve">Рассмотрим влияние одного генератора на другой. Сигнал с выхода усилителя A1 проходит с первого входа сумматора на второй, т.е. на выход усилителя A2, с подавлением S12. Если подавление мало (например, при использовании ненаправленного резистивного сумматора), то на выходном каскаде A2 возникает </w:t>
-      </w:r>
-      <w:proofErr w:type="spellStart"/>
-      <w:r>
-        <w:rPr>
-          <w:lang w:val="ru-RU" w:eastAsia="ru-RU"/>
-        </w:rPr>
-        <w:t>интермодуляция</w:t>
-      </w:r>
-      <w:proofErr w:type="spellEnd"/>
-      <w:r>
-        <w:rPr>
-          <w:lang w:val="ru-RU" w:eastAsia="ru-RU"/>
-        </w:rPr>
-        <w:t xml:space="preserve"> с неравными тонами. Оценку продуктов </w:t>
-      </w:r>
-      <w:proofErr w:type="spellStart"/>
-      <w:r>
-        <w:rPr>
-          <w:lang w:val="ru-RU" w:eastAsia="ru-RU"/>
-        </w:rPr>
-        <w:t>интермодуляции</w:t>
-      </w:r>
-      <w:proofErr w:type="spellEnd"/>
-      <w:r>
-        <w:rPr>
-          <w:lang w:val="ru-RU" w:eastAsia="ru-RU"/>
-        </w:rPr>
-        <w:t xml:space="preserve"> можно произвести с помощью выражений (11, 13). Наличие развязки существенно улучшает характеристики – значения IMD2 и IMD3 увеличиваются приблизительно на S12 (в </w:t>
-      </w:r>
-      <w:proofErr w:type="spellStart"/>
-      <w:r>
-        <w:rPr>
-          <w:lang w:val="ru-RU" w:eastAsia="ru-RU"/>
-        </w:rPr>
-        <w:t>логаримическом</w:t>
-      </w:r>
-      <w:proofErr w:type="spellEnd"/>
-      <w:r>
-        <w:rPr>
-          <w:lang w:val="ru-RU" w:eastAsia="ru-RU"/>
-        </w:rPr>
-        <w:t xml:space="preserve"> масштабе) при том же уровне мощности сигнала на выходе!</w:t>
+        <w:t>Рассмотрим влияние одного генератора на другой. Сигнал с выхода усилителя A1 проходит с первого входа сумматора на второй, т.е. на выход усилителя A2, с подавлением S12. Если подавление мало (например, при использовании ненаправленного резистивного сумматора), то на выходном каскаде A2 возникает интермодуляция с неравными тонами. Оценку продуктов интермодуляции можно произвести с помощью выражений (11, 13). Наличие развязки существенно улучшает характеристики – значения IMD2 и IMD3 увеличиваются приблизительно на S12 (в логаримическом масштабе) при том же уровне мощности сигнала на выходе!</w:t>
       </w:r>
     </w:p>
     <w:p>
@@ -6838,41 +6824,13 @@
         <w:rPr>
           <w:lang w:val="ru-RU" w:eastAsia="ru-RU"/>
         </w:rPr>
-        <w:t xml:space="preserve">Уровень </w:t>
-      </w:r>
-      <w:proofErr w:type="spellStart"/>
-      <w:r>
-        <w:rPr>
-          <w:lang w:val="ru-RU" w:eastAsia="ru-RU"/>
-        </w:rPr>
-        <w:t>двухтонального</w:t>
-      </w:r>
-      <w:proofErr w:type="spellEnd"/>
-      <w:r>
-        <w:rPr>
-          <w:lang w:val="ru-RU" w:eastAsia="ru-RU"/>
-        </w:rPr>
-        <w:t xml:space="preserve"> сигнала на входе и выходе усилителя</w:t>
-      </w:r>
-      <w:r>
-        <w:rPr>
-          <w:lang w:val="ru-RU" w:eastAsia="ru-RU"/>
-        </w:rPr>
-        <w:t xml:space="preserve">, мощность на выходе сумматора должна быть на 10 </w:t>
-      </w:r>
-      <w:proofErr w:type="spellStart"/>
-      <w:r>
-        <w:rPr>
-          <w:lang w:val="ru-RU" w:eastAsia="ru-RU"/>
-        </w:rPr>
-        <w:t>дБмВт</w:t>
-      </w:r>
-      <w:proofErr w:type="spellEnd"/>
-      <w:r>
-        <w:rPr>
-          <w:lang w:val="ru-RU" w:eastAsia="ru-RU"/>
-        </w:rPr>
-        <w:t xml:space="preserve"> ниже точки компрессии по входу</w:t>
+        <w:t>Уровень двухтонального сигнала на входе и выходе усилителя</w:t>
+      </w:r>
+      <w:r>
+        <w:rPr>
+          <w:lang w:val="ru-RU" w:eastAsia="ru-RU"/>
+        </w:rPr>
+        <w:t>, мощность на выходе сумматора должна быть на 10 дБмВт ниже точки компрессии по входу</w:t>
       </w:r>
       <w:r>
         <w:rPr>
@@ -6896,21 +6854,7 @@
         <w:rPr>
           <w:lang w:val="ru-RU" w:eastAsia="ru-RU"/>
         </w:rPr>
-        <w:t xml:space="preserve">Уровень продуктов </w:t>
-      </w:r>
-      <w:proofErr w:type="spellStart"/>
-      <w:r>
-        <w:rPr>
-          <w:lang w:val="ru-RU" w:eastAsia="ru-RU"/>
-        </w:rPr>
-        <w:t>интермодуляции</w:t>
-      </w:r>
-      <w:proofErr w:type="spellEnd"/>
-      <w:r>
-        <w:rPr>
-          <w:lang w:val="ru-RU" w:eastAsia="ru-RU"/>
-        </w:rPr>
-        <w:t xml:space="preserve"> третьего порядка</w:t>
+        <w:t>Уровень продуктов интермодуляции третьего порядка</w:t>
       </w:r>
       <w:r>
         <w:rPr>
@@ -6964,23 +6908,7 @@
           <w:rFonts w:ascii="Times New Roman" w:eastAsia="Times New Roman" w:hAnsi="Times New Roman" w:cs="Times New Roman"/>
           <w:lang w:val="ru-RU" w:eastAsia="ru-RU"/>
         </w:rPr>
-        <w:t xml:space="preserve">Подготовка к </w:t>
-      </w:r>
-      <w:proofErr w:type="spellStart"/>
-      <w:r>
-        <w:rPr>
-          <w:rFonts w:ascii="Times New Roman" w:eastAsia="Times New Roman" w:hAnsi="Times New Roman" w:cs="Times New Roman"/>
-          <w:lang w:val="ru-RU" w:eastAsia="ru-RU"/>
-        </w:rPr>
-        <w:t>лаборатоной</w:t>
-      </w:r>
-      <w:proofErr w:type="spellEnd"/>
-      <w:r>
-        <w:rPr>
-          <w:rFonts w:ascii="Times New Roman" w:eastAsia="Times New Roman" w:hAnsi="Times New Roman" w:cs="Times New Roman"/>
-          <w:lang w:val="ru-RU" w:eastAsia="ru-RU"/>
-        </w:rPr>
-        <w:t xml:space="preserve"> работе</w:t>
+        <w:t>Подготовка к лаборатоной работе</w:t>
       </w:r>
       <w:r>
         <w:rPr>
@@ -7154,35 +7082,7 @@
         <w:rPr>
           <w:lang w:val="ru-RU" w:eastAsia="ru-RU"/>
         </w:rPr>
-        <w:t xml:space="preserve">После проверки установки, установите на генераторах сигнала два тона одинаковой мощности -30 </w:t>
-      </w:r>
-      <w:proofErr w:type="spellStart"/>
-      <w:r>
-        <w:rPr>
-          <w:lang w:val="ru-RU" w:eastAsia="ru-RU"/>
-        </w:rPr>
-        <w:t>дБмВт</w:t>
-      </w:r>
-      <w:proofErr w:type="spellEnd"/>
-      <w:r>
-        <w:rPr>
-          <w:lang w:val="ru-RU" w:eastAsia="ru-RU"/>
-        </w:rPr>
-        <w:t xml:space="preserve"> и зафиксируйте гармоники основного тона и продуктов </w:t>
-      </w:r>
-      <w:proofErr w:type="spellStart"/>
-      <w:r>
-        <w:rPr>
-          <w:lang w:val="ru-RU" w:eastAsia="ru-RU"/>
-        </w:rPr>
-        <w:t>интермодуляции</w:t>
-      </w:r>
-      <w:proofErr w:type="spellEnd"/>
-      <w:r>
-        <w:rPr>
-          <w:lang w:val="ru-RU" w:eastAsia="ru-RU"/>
-        </w:rPr>
-        <w:t xml:space="preserve"> на анализаторе спектра.</w:t>
+        <w:t>После проверки установки, установите на генераторах сигнала два тона одинаковой мощности -30 дБмВт и зафиксируйте гармоники основного тона и продуктов интермодуляции на анализаторе спектра.</w:t>
       </w:r>
     </w:p>
     <w:p>
@@ -7296,8 +7196,8 @@
       </w:r>
     </w:p>
     <w:sectPr>
-      <w:footerReference w:type="default" r:id="rId18"/>
-      <w:footerReference w:type="first" r:id="rId19"/>
+      <w:footerReference w:type="default" r:id="rId23"/>
+      <w:footerReference w:type="first" r:id="rId24"/>
       <w:pgSz w:w="11906" w:h="16838"/>
       <w:pgMar w:top="1134" w:right="850" w:bottom="1134" w:left="1701" w:header="709" w:footer="709" w:gutter="0"/>
       <w:cols w:space="720"/>
@@ -7765,6 +7665,95 @@
     </w:lvl>
   </w:abstractNum>
   <w:abstractNum w:abstractNumId="11" w15:restartNumberingAfterBreak="0">
+    <w:nsid w:val="472F1F7A"/>
+    <w:multiLevelType w:val="hybridMultilevel"/>
+    <w:tmpl w:val="A1748F74"/>
+    <w:lvl w:ilvl="0" w:tplc="394C8ADC">
+      <w:start w:val="1"/>
+      <w:numFmt w:val="decimal"/>
+      <w:lvlText w:val="%1)"/>
+      <w:lvlJc w:val="left"/>
+      <w:pPr>
+        <w:ind w:left="1069" w:hanging="360"/>
+      </w:pPr>
+      <w:rPr>
+        <w:rFonts w:hint="default"/>
+      </w:rPr>
+    </w:lvl>
+    <w:lvl w:ilvl="1" w:tplc="04190019" w:tentative="1">
+      <w:start w:val="1"/>
+      <w:numFmt w:val="lowerLetter"/>
+      <w:lvlText w:val="%2."/>
+      <w:lvlJc w:val="left"/>
+      <w:pPr>
+        <w:ind w:left="1789" w:hanging="360"/>
+      </w:pPr>
+    </w:lvl>
+    <w:lvl w:ilvl="2" w:tplc="0419001B" w:tentative="1">
+      <w:start w:val="1"/>
+      <w:numFmt w:val="lowerRoman"/>
+      <w:lvlText w:val="%3."/>
+      <w:lvlJc w:val="right"/>
+      <w:pPr>
+        <w:ind w:left="2509" w:hanging="180"/>
+      </w:pPr>
+    </w:lvl>
+    <w:lvl w:ilvl="3" w:tplc="0419000F" w:tentative="1">
+      <w:start w:val="1"/>
+      <w:numFmt w:val="decimal"/>
+      <w:lvlText w:val="%4."/>
+      <w:lvlJc w:val="left"/>
+      <w:pPr>
+        <w:ind w:left="3229" w:hanging="360"/>
+      </w:pPr>
+    </w:lvl>
+    <w:lvl w:ilvl="4" w:tplc="04190019" w:tentative="1">
+      <w:start w:val="1"/>
+      <w:numFmt w:val="lowerLetter"/>
+      <w:lvlText w:val="%5."/>
+      <w:lvlJc w:val="left"/>
+      <w:pPr>
+        <w:ind w:left="3949" w:hanging="360"/>
+      </w:pPr>
+    </w:lvl>
+    <w:lvl w:ilvl="5" w:tplc="0419001B" w:tentative="1">
+      <w:start w:val="1"/>
+      <w:numFmt w:val="lowerRoman"/>
+      <w:lvlText w:val="%6."/>
+      <w:lvlJc w:val="right"/>
+      <w:pPr>
+        <w:ind w:left="4669" w:hanging="180"/>
+      </w:pPr>
+    </w:lvl>
+    <w:lvl w:ilvl="6" w:tplc="0419000F" w:tentative="1">
+      <w:start w:val="1"/>
+      <w:numFmt w:val="decimal"/>
+      <w:lvlText w:val="%7."/>
+      <w:lvlJc w:val="left"/>
+      <w:pPr>
+        <w:ind w:left="5389" w:hanging="360"/>
+      </w:pPr>
+    </w:lvl>
+    <w:lvl w:ilvl="7" w:tplc="04190019" w:tentative="1">
+      <w:start w:val="1"/>
+      <w:numFmt w:val="lowerLetter"/>
+      <w:lvlText w:val="%8."/>
+      <w:lvlJc w:val="left"/>
+      <w:pPr>
+        <w:ind w:left="6109" w:hanging="360"/>
+      </w:pPr>
+    </w:lvl>
+    <w:lvl w:ilvl="8" w:tplc="0419001B" w:tentative="1">
+      <w:start w:val="1"/>
+      <w:numFmt w:val="lowerRoman"/>
+      <w:lvlText w:val="%9."/>
+      <w:lvlJc w:val="right"/>
+      <w:pPr>
+        <w:ind w:left="6829" w:hanging="180"/>
+      </w:pPr>
+    </w:lvl>
+  </w:abstractNum>
+  <w:abstractNum w:abstractNumId="12" w15:restartNumberingAfterBreak="0">
     <w:nsid w:val="58823B88"/>
     <w:multiLevelType w:val="hybridMultilevel"/>
     <w:tmpl w:val="99027AB8"/>
@@ -7887,6 +7876,9 @@
     <w:abstractNumId w:val="10"/>
   </w:num>
   <w:num w:numId="12">
+    <w:abstractNumId w:val="12"/>
+  </w:num>
+  <w:num w:numId="13">
     <w:abstractNumId w:val="11"/>
   </w:num>
 </w:numbering>
@@ -8508,6 +8500,7 @@
   <w:style w:type="character" w:default="1" w:styleId="a2">
     <w:name w:val="Default Paragraph Font"/>
     <w:uiPriority w:val="1"/>
+    <w:semiHidden/>
     <w:unhideWhenUsed/>
   </w:style>
   <w:style w:type="table" w:default="1" w:styleId="a3">

</xml_diff>